<commit_message>
style(layout): expand line-height and math formula vertical spacing across web, pdf and docx
</commit_message>
<xml_diff>
--- a/2-2_三角函數的定義與性質_四節課教學計畫與教案.docx
+++ b/2-2_三角函數的定義與性質_四節課教學計畫與教案.docx
@@ -70,7 +70,7 @@
           </w:tcPr>
           <w:p>
             <w:pPr>
-              <w:spacing w:before="40" w:after="60" w:line="288" w:lineRule="auto"/>
+              <w:spacing w:before="60" w:after="100" w:line="324" w:lineRule="auto"/>
               <w:jc w:val="left"/>
             </w:pPr>
             <w:r>
@@ -97,7 +97,7 @@
           </w:tcPr>
           <w:p>
             <w:pPr>
-              <w:spacing w:before="40" w:after="60" w:line="288" w:lineRule="auto"/>
+              <w:spacing w:before="60" w:after="100" w:line="324" w:lineRule="auto"/>
               <w:jc w:val="left"/>
             </w:pPr>
             <w:r>
@@ -124,7 +124,7 @@
           </w:tcPr>
           <w:p>
             <w:pPr>
-              <w:spacing w:before="40" w:after="60" w:line="288" w:lineRule="auto"/>
+              <w:spacing w:before="60" w:after="100" w:line="324" w:lineRule="auto"/>
               <w:jc w:val="left"/>
             </w:pPr>
             <w:r>
@@ -151,7 +151,7 @@
           </w:tcPr>
           <w:p>
             <w:pPr>
-              <w:spacing w:before="40" w:after="60" w:line="288" w:lineRule="auto"/>
+              <w:spacing w:before="60" w:after="100" w:line="324" w:lineRule="auto"/>
               <w:jc w:val="left"/>
             </w:pPr>
             <w:r>
@@ -180,7 +180,7 @@
           </w:tcPr>
           <w:p>
             <w:pPr>
-              <w:spacing w:before="40" w:after="60" w:line="288" w:lineRule="auto"/>
+              <w:spacing w:before="60" w:after="100" w:line="324" w:lineRule="auto"/>
               <w:jc w:val="left"/>
             </w:pPr>
             <w:r>
@@ -207,7 +207,7 @@
           </w:tcPr>
           <w:p>
             <w:pPr>
-              <w:spacing w:before="40" w:after="60" w:line="288" w:lineRule="auto"/>
+              <w:spacing w:before="60" w:after="100" w:line="324" w:lineRule="auto"/>
               <w:jc w:val="left"/>
             </w:pPr>
             <w:r>
@@ -234,7 +234,7 @@
           </w:tcPr>
           <w:p>
             <w:pPr>
-              <w:spacing w:before="40" w:after="60" w:line="288" w:lineRule="auto"/>
+              <w:spacing w:before="60" w:after="100" w:line="324" w:lineRule="auto"/>
               <w:jc w:val="left"/>
             </w:pPr>
             <w:r>
@@ -261,7 +261,7 @@
           </w:tcPr>
           <w:p>
             <w:pPr>
-              <w:spacing w:before="40" w:after="60" w:line="288" w:lineRule="auto"/>
+              <w:spacing w:before="60" w:after="100" w:line="324" w:lineRule="auto"/>
               <w:jc w:val="left"/>
             </w:pPr>
             <w:r>
@@ -290,7 +290,7 @@
           </w:tcPr>
           <w:p>
             <w:pPr>
-              <w:spacing w:before="40" w:after="60" w:line="288" w:lineRule="auto"/>
+              <w:spacing w:before="60" w:after="100" w:line="324" w:lineRule="auto"/>
               <w:jc w:val="left"/>
             </w:pPr>
             <w:r>
@@ -317,7 +317,7 @@
           </w:tcPr>
           <w:p>
             <w:pPr>
-              <w:spacing w:before="40" w:after="60" w:line="288" w:lineRule="auto"/>
+              <w:spacing w:before="60" w:after="100" w:line="324" w:lineRule="auto"/>
               <w:jc w:val="left"/>
             </w:pPr>
             <w:r>
@@ -344,7 +344,7 @@
           </w:tcPr>
           <w:p>
             <w:pPr>
-              <w:spacing w:before="40" w:after="60" w:line="288" w:lineRule="auto"/>
+              <w:spacing w:before="60" w:after="100" w:line="324" w:lineRule="auto"/>
               <w:jc w:val="left"/>
             </w:pPr>
             <w:r>
@@ -371,7 +371,7 @@
           </w:tcPr>
           <w:p>
             <w:pPr>
-              <w:spacing w:before="40" w:after="60" w:line="288" w:lineRule="auto"/>
+              <w:spacing w:before="60" w:after="100" w:line="324" w:lineRule="auto"/>
               <w:jc w:val="left"/>
             </w:pPr>
             <w:r>
@@ -400,7 +400,7 @@
           </w:tcPr>
           <w:p>
             <w:pPr>
-              <w:spacing w:before="40" w:after="60" w:line="288" w:lineRule="auto"/>
+              <w:spacing w:before="60" w:after="100" w:line="324" w:lineRule="auto"/>
               <w:jc w:val="left"/>
             </w:pPr>
             <w:r>
@@ -427,7 +427,7 @@
           </w:tcPr>
           <w:p>
             <w:pPr>
-              <w:spacing w:before="40" w:after="60" w:line="288" w:lineRule="auto"/>
+              <w:spacing w:before="60" w:after="100" w:line="324" w:lineRule="auto"/>
               <w:jc w:val="left"/>
             </w:pPr>
             <w:r>
@@ -454,7 +454,7 @@
           </w:tcPr>
           <w:p>
             <w:pPr>
-              <w:spacing w:before="40" w:after="60" w:line="288" w:lineRule="auto"/>
+              <w:spacing w:before="60" w:after="100" w:line="324" w:lineRule="auto"/>
               <w:jc w:val="left"/>
             </w:pPr>
             <w:r>
@@ -481,7 +481,7 @@
           </w:tcPr>
           <w:p>
             <w:pPr>
-              <w:spacing w:before="40" w:after="60" w:line="288" w:lineRule="auto"/>
+              <w:spacing w:before="60" w:after="100" w:line="324" w:lineRule="auto"/>
               <w:jc w:val="left"/>
             </w:pPr>
             <w:r>
@@ -551,7 +551,7 @@
           </w:tcPr>
           <w:p>
             <w:pPr>
-              <w:spacing w:before="40" w:after="60" w:line="288" w:lineRule="auto"/>
+              <w:spacing w:before="60" w:after="100" w:line="324" w:lineRule="auto"/>
               <w:jc w:val="center"/>
             </w:pPr>
             <w:r>
@@ -578,7 +578,7 @@
           </w:tcPr>
           <w:p>
             <w:pPr>
-              <w:spacing w:before="40" w:after="60" w:line="288" w:lineRule="auto"/>
+              <w:spacing w:before="60" w:after="100" w:line="324" w:lineRule="auto"/>
               <w:jc w:val="center"/>
             </w:pPr>
             <w:r>
@@ -605,7 +605,7 @@
           </w:tcPr>
           <w:p>
             <w:pPr>
-              <w:spacing w:before="40" w:after="60" w:line="288" w:lineRule="auto"/>
+              <w:spacing w:before="60" w:after="100" w:line="324" w:lineRule="auto"/>
               <w:jc w:val="center"/>
             </w:pPr>
             <w:r>
@@ -632,7 +632,7 @@
           </w:tcPr>
           <w:p>
             <w:pPr>
-              <w:spacing w:before="40" w:after="60" w:line="288" w:lineRule="auto"/>
+              <w:spacing w:before="60" w:after="100" w:line="324" w:lineRule="auto"/>
               <w:jc w:val="center"/>
             </w:pPr>
             <w:r>
@@ -659,7 +659,7 @@
           </w:tcPr>
           <w:p>
             <w:pPr>
-              <w:spacing w:before="40" w:after="60" w:line="288" w:lineRule="auto"/>
+              <w:spacing w:before="60" w:after="100" w:line="324" w:lineRule="auto"/>
               <w:jc w:val="center"/>
             </w:pPr>
             <w:r>
@@ -688,7 +688,7 @@
           </w:tcPr>
           <w:p>
             <w:pPr>
-              <w:spacing w:before="40" w:after="60" w:line="288" w:lineRule="auto"/>
+              <w:spacing w:before="60" w:after="100" w:line="324" w:lineRule="auto"/>
               <w:jc w:val="center"/>
             </w:pPr>
             <w:r>
@@ -703,7 +703,7 @@
           </w:p>
           <w:p>
             <w:pPr>
-              <w:spacing w:before="40" w:after="60" w:line="288" w:lineRule="auto"/>
+              <w:spacing w:before="60" w:after="100" w:line="324" w:lineRule="auto"/>
               <w:jc w:val="center"/>
             </w:pPr>
             <w:r>
@@ -730,7 +730,7 @@
           </w:tcPr>
           <w:p>
             <w:pPr>
-              <w:spacing w:before="40" w:after="60" w:line="288" w:lineRule="auto"/>
+              <w:spacing w:before="60" w:after="100" w:line="324" w:lineRule="auto"/>
               <w:jc w:val="left"/>
             </w:pPr>
             <w:r>
@@ -745,7 +745,7 @@
           </w:p>
           <w:p>
             <w:pPr>
-              <w:spacing w:before="40" w:after="60" w:line="288" w:lineRule="auto"/>
+              <w:spacing w:before="60" w:after="100" w:line="324" w:lineRule="auto"/>
               <w:jc w:val="left"/>
             </w:pPr>
             <w:r>
@@ -772,7 +772,7 @@
           </w:tcPr>
           <w:p>
             <w:pPr>
-              <w:spacing w:before="40" w:after="60" w:line="288" w:lineRule="auto"/>
+              <w:spacing w:before="60" w:after="100" w:line="324" w:lineRule="auto"/>
               <w:jc w:val="left"/>
             </w:pPr>
             <w:r>
@@ -787,7 +787,7 @@
           </w:p>
           <w:p>
             <w:pPr>
-              <w:spacing w:before="40" w:after="60" w:line="288" w:lineRule="auto"/>
+              <w:spacing w:before="60" w:after="100" w:line="324" w:lineRule="auto"/>
               <w:jc w:val="left"/>
             </w:pPr>
             <w:r>
@@ -802,7 +802,7 @@
           </w:p>
           <w:p>
             <w:pPr>
-              <w:spacing w:before="40" w:after="60" w:line="288" w:lineRule="auto"/>
+              <w:spacing w:before="60" w:after="100" w:line="324" w:lineRule="auto"/>
               <w:jc w:val="left"/>
             </w:pPr>
             <w:r>
@@ -829,7 +829,7 @@
           </w:tcPr>
           <w:p>
             <w:pPr>
-              <w:spacing w:before="40" w:after="60" w:line="288" w:lineRule="auto"/>
+              <w:spacing w:before="60" w:after="100" w:line="324" w:lineRule="auto"/>
               <w:jc w:val="left"/>
             </w:pPr>
             <w:r>
@@ -844,7 +844,7 @@
           </w:p>
           <w:p>
             <w:pPr>
-              <w:spacing w:before="40" w:after="60" w:line="288" w:lineRule="auto"/>
+              <w:spacing w:before="60" w:after="100" w:line="324" w:lineRule="auto"/>
               <w:jc w:val="left"/>
             </w:pPr>
             <w:r>
@@ -859,7 +859,7 @@
           </w:p>
           <w:p>
             <w:pPr>
-              <w:spacing w:before="40" w:after="60" w:line="288" w:lineRule="auto"/>
+              <w:spacing w:before="60" w:after="100" w:line="324" w:lineRule="auto"/>
               <w:jc w:val="left"/>
             </w:pPr>
             <w:r>
@@ -886,7 +886,7 @@
           </w:tcPr>
           <w:p>
             <w:pPr>
-              <w:spacing w:before="40" w:after="60" w:line="288" w:lineRule="auto"/>
+              <w:spacing w:before="60" w:after="100" w:line="324" w:lineRule="auto"/>
               <w:jc w:val="left"/>
             </w:pPr>
             <w:r>
@@ -901,7 +901,7 @@
           </w:p>
           <w:p>
             <w:pPr>
-              <w:spacing w:before="40" w:after="60" w:line="288" w:lineRule="auto"/>
+              <w:spacing w:before="60" w:after="100" w:line="324" w:lineRule="auto"/>
               <w:jc w:val="left"/>
             </w:pPr>
             <w:r>
@@ -978,7 +978,7 @@
           </w:p>
           <w:p>
             <w:pPr>
-              <w:spacing w:before="40" w:after="60" w:line="288" w:lineRule="auto"/>
+              <w:spacing w:before="60" w:after="100" w:line="324" w:lineRule="auto"/>
               <w:jc w:val="left"/>
             </w:pPr>
             <w:r>
@@ -1021,7 +1021,7 @@
           </w:p>
           <w:p>
             <w:pPr>
-              <w:spacing w:before="40" w:after="60" w:line="288" w:lineRule="auto"/>
+              <w:spacing w:before="60" w:after="100" w:line="324" w:lineRule="auto"/>
               <w:jc w:val="left"/>
             </w:pPr>
             <w:r>
@@ -1064,7 +1064,7 @@
           </w:tcPr>
           <w:p>
             <w:pPr>
-              <w:spacing w:before="40" w:after="60" w:line="288" w:lineRule="auto"/>
+              <w:spacing w:before="60" w:after="100" w:line="324" w:lineRule="auto"/>
               <w:jc w:val="center"/>
             </w:pPr>
             <w:r>
@@ -1079,7 +1079,7 @@
           </w:p>
           <w:p>
             <w:pPr>
-              <w:spacing w:before="40" w:after="60" w:line="288" w:lineRule="auto"/>
+              <w:spacing w:before="60" w:after="100" w:line="324" w:lineRule="auto"/>
               <w:jc w:val="center"/>
             </w:pPr>
             <w:r>
@@ -1106,7 +1106,7 @@
           </w:tcPr>
           <w:p>
             <w:pPr>
-              <w:spacing w:before="40" w:after="60" w:line="288" w:lineRule="auto"/>
+              <w:spacing w:before="60" w:after="100" w:line="324" w:lineRule="auto"/>
               <w:jc w:val="left"/>
             </w:pPr>
             <w:r>
@@ -1121,7 +1121,7 @@
           </w:p>
           <w:p>
             <w:pPr>
-              <w:spacing w:before="40" w:after="60" w:line="288" w:lineRule="auto"/>
+              <w:spacing w:before="60" w:after="100" w:line="324" w:lineRule="auto"/>
               <w:jc w:val="left"/>
             </w:pPr>
             <w:r>
@@ -1148,7 +1148,7 @@
           </w:tcPr>
           <w:p>
             <w:pPr>
-              <w:spacing w:before="40" w:after="60" w:line="288" w:lineRule="auto"/>
+              <w:spacing w:before="60" w:after="100" w:line="324" w:lineRule="auto"/>
               <w:jc w:val="left"/>
             </w:pPr>
             <w:r>
@@ -1163,7 +1163,7 @@
           </w:p>
           <w:p>
             <w:pPr>
-              <w:spacing w:before="40" w:after="60" w:line="288" w:lineRule="auto"/>
+              <w:spacing w:before="60" w:after="100" w:line="324" w:lineRule="auto"/>
               <w:jc w:val="left"/>
             </w:pPr>
             <w:r>
@@ -1178,7 +1178,7 @@
           </w:p>
           <w:p>
             <w:pPr>
-              <w:spacing w:before="40" w:after="60" w:line="288" w:lineRule="auto"/>
+              <w:spacing w:before="60" w:after="100" w:line="324" w:lineRule="auto"/>
               <w:jc w:val="left"/>
             </w:pPr>
             <w:r>
@@ -1205,7 +1205,7 @@
           </w:tcPr>
           <w:p>
             <w:pPr>
-              <w:spacing w:before="40" w:after="60" w:line="288" w:lineRule="auto"/>
+              <w:spacing w:before="60" w:after="100" w:line="324" w:lineRule="auto"/>
               <w:jc w:val="left"/>
             </w:pPr>
             <w:r>
@@ -1220,7 +1220,7 @@
           </w:p>
           <w:p>
             <w:pPr>
-              <w:spacing w:before="40" w:after="60" w:line="288" w:lineRule="auto"/>
+              <w:spacing w:before="60" w:after="100" w:line="324" w:lineRule="auto"/>
               <w:jc w:val="left"/>
             </w:pPr>
             <w:r>
@@ -1235,7 +1235,7 @@
           </w:p>
           <w:p>
             <w:pPr>
-              <w:spacing w:before="40" w:after="60" w:line="288" w:lineRule="auto"/>
+              <w:spacing w:before="60" w:after="100" w:line="324" w:lineRule="auto"/>
               <w:jc w:val="left"/>
             </w:pPr>
             <w:r>
@@ -1262,7 +1262,7 @@
           </w:tcPr>
           <w:p>
             <w:pPr>
-              <w:spacing w:before="40" w:after="60" w:line="288" w:lineRule="auto"/>
+              <w:spacing w:before="60" w:after="100" w:line="324" w:lineRule="auto"/>
               <w:jc w:val="left"/>
             </w:pPr>
             <w:r>
@@ -1330,7 +1330,7 @@
           </w:p>
           <w:p>
             <w:pPr>
-              <w:spacing w:before="40" w:after="60" w:line="288" w:lineRule="auto"/>
+              <w:spacing w:before="60" w:after="100" w:line="324" w:lineRule="auto"/>
               <w:jc w:val="left"/>
             </w:pPr>
             <w:r>
@@ -1395,7 +1395,7 @@
           </w:p>
           <w:p>
             <w:pPr>
-              <w:spacing w:before="40" w:after="60" w:line="288" w:lineRule="auto"/>
+              <w:spacing w:before="60" w:after="100" w:line="324" w:lineRule="auto"/>
               <w:jc w:val="left"/>
             </w:pPr>
             <w:r>
@@ -1468,7 +1468,7 @@
           </w:p>
           <w:p>
             <w:pPr>
-              <w:spacing w:before="40" w:after="60" w:line="288" w:lineRule="auto"/>
+              <w:spacing w:before="60" w:after="100" w:line="324" w:lineRule="auto"/>
               <w:jc w:val="left"/>
             </w:pPr>
             <w:r>
@@ -1497,7 +1497,7 @@
           </w:tcPr>
           <w:p>
             <w:pPr>
-              <w:spacing w:before="40" w:after="60" w:line="288" w:lineRule="auto"/>
+              <w:spacing w:before="60" w:after="100" w:line="324" w:lineRule="auto"/>
               <w:jc w:val="center"/>
             </w:pPr>
             <w:r>
@@ -1512,7 +1512,7 @@
           </w:p>
           <w:p>
             <w:pPr>
-              <w:spacing w:before="40" w:after="60" w:line="288" w:lineRule="auto"/>
+              <w:spacing w:before="60" w:after="100" w:line="324" w:lineRule="auto"/>
               <w:jc w:val="center"/>
             </w:pPr>
             <w:r>
@@ -1539,7 +1539,7 @@
           </w:tcPr>
           <w:p>
             <w:pPr>
-              <w:spacing w:before="40" w:after="60" w:line="288" w:lineRule="auto"/>
+              <w:spacing w:before="60" w:after="100" w:line="324" w:lineRule="auto"/>
               <w:jc w:val="left"/>
             </w:pPr>
             <w:r>
@@ -1554,7 +1554,7 @@
           </w:p>
           <w:p>
             <w:pPr>
-              <w:spacing w:before="40" w:after="60" w:line="288" w:lineRule="auto"/>
+              <w:spacing w:before="60" w:after="100" w:line="324" w:lineRule="auto"/>
               <w:jc w:val="left"/>
             </w:pPr>
             <w:r>
@@ -1581,7 +1581,7 @@
           </w:tcPr>
           <w:p>
             <w:pPr>
-              <w:spacing w:before="40" w:after="60" w:line="288" w:lineRule="auto"/>
+              <w:spacing w:before="60" w:after="100" w:line="324" w:lineRule="auto"/>
               <w:jc w:val="left"/>
             </w:pPr>
             <w:r>
@@ -1596,7 +1596,7 @@
           </w:p>
           <w:p>
             <w:pPr>
-              <w:spacing w:before="40" w:after="60" w:line="288" w:lineRule="auto"/>
+              <w:spacing w:before="60" w:after="100" w:line="324" w:lineRule="auto"/>
               <w:jc w:val="left"/>
             </w:pPr>
             <w:r>
@@ -1611,7 +1611,7 @@
           </w:p>
           <w:p>
             <w:pPr>
-              <w:spacing w:before="40" w:after="60" w:line="288" w:lineRule="auto"/>
+              <w:spacing w:before="60" w:after="100" w:line="324" w:lineRule="auto"/>
               <w:jc w:val="left"/>
             </w:pPr>
             <w:r>
@@ -1638,7 +1638,7 @@
           </w:tcPr>
           <w:p>
             <w:pPr>
-              <w:spacing w:before="40" w:after="60" w:line="288" w:lineRule="auto"/>
+              <w:spacing w:before="60" w:after="100" w:line="324" w:lineRule="auto"/>
               <w:jc w:val="left"/>
             </w:pPr>
             <w:r>
@@ -1653,7 +1653,7 @@
           </w:p>
           <w:p>
             <w:pPr>
-              <w:spacing w:before="40" w:after="60" w:line="288" w:lineRule="auto"/>
+              <w:spacing w:before="60" w:after="100" w:line="324" w:lineRule="auto"/>
               <w:jc w:val="left"/>
             </w:pPr>
             <w:r>
@@ -1668,7 +1668,7 @@
           </w:p>
           <w:p>
             <w:pPr>
-              <w:spacing w:before="40" w:after="60" w:line="288" w:lineRule="auto"/>
+              <w:spacing w:before="60" w:after="100" w:line="324" w:lineRule="auto"/>
               <w:jc w:val="left"/>
             </w:pPr>
             <w:r>
@@ -1695,7 +1695,7 @@
           </w:tcPr>
           <w:p>
             <w:pPr>
-              <w:spacing w:before="40" w:after="60" w:line="288" w:lineRule="auto"/>
+              <w:spacing w:before="60" w:after="100" w:line="324" w:lineRule="auto"/>
               <w:jc w:val="left"/>
             </w:pPr>
             <w:r>
@@ -1710,7 +1710,7 @@
           </w:p>
           <w:p>
             <w:pPr>
-              <w:spacing w:before="40" w:after="60" w:line="288" w:lineRule="auto"/>
+              <w:spacing w:before="60" w:after="100" w:line="324" w:lineRule="auto"/>
               <w:jc w:val="left"/>
             </w:pPr>
             <w:r>
@@ -1859,7 +1859,7 @@
           </w:p>
           <w:p>
             <w:pPr>
-              <w:spacing w:before="40" w:after="60" w:line="288" w:lineRule="auto"/>
+              <w:spacing w:before="60" w:after="100" w:line="324" w:lineRule="auto"/>
               <w:jc w:val="left"/>
             </w:pPr>
             <w:r>
@@ -1924,7 +1924,7 @@
           </w:p>
           <w:p>
             <w:pPr>
-              <w:spacing w:before="40" w:after="60" w:line="288" w:lineRule="auto"/>
+              <w:spacing w:before="60" w:after="100" w:line="324" w:lineRule="auto"/>
               <w:jc w:val="left"/>
             </w:pPr>
             <w:r>
@@ -1973,7 +1973,7 @@
           </w:tcPr>
           <w:p>
             <w:pPr>
-              <w:spacing w:before="40" w:after="60" w:line="288" w:lineRule="auto"/>
+              <w:spacing w:before="60" w:after="100" w:line="324" w:lineRule="auto"/>
               <w:jc w:val="center"/>
             </w:pPr>
             <w:r>
@@ -1988,7 +1988,7 @@
           </w:p>
           <w:p>
             <w:pPr>
-              <w:spacing w:before="40" w:after="60" w:line="288" w:lineRule="auto"/>
+              <w:spacing w:before="60" w:after="100" w:line="324" w:lineRule="auto"/>
               <w:jc w:val="center"/>
             </w:pPr>
             <w:r>
@@ -2015,7 +2015,7 @@
           </w:tcPr>
           <w:p>
             <w:pPr>
-              <w:spacing w:before="40" w:after="60" w:line="288" w:lineRule="auto"/>
+              <w:spacing w:before="60" w:after="100" w:line="324" w:lineRule="auto"/>
               <w:jc w:val="left"/>
             </w:pPr>
             <w:r>
@@ -2030,7 +2030,7 @@
           </w:p>
           <w:p>
             <w:pPr>
-              <w:spacing w:before="40" w:after="60" w:line="288" w:lineRule="auto"/>
+              <w:spacing w:before="60" w:after="100" w:line="324" w:lineRule="auto"/>
               <w:jc w:val="left"/>
             </w:pPr>
             <w:r>
@@ -2057,7 +2057,7 @@
           </w:tcPr>
           <w:p>
             <w:pPr>
-              <w:spacing w:before="40" w:after="60" w:line="288" w:lineRule="auto"/>
+              <w:spacing w:before="60" w:after="100" w:line="324" w:lineRule="auto"/>
               <w:jc w:val="left"/>
             </w:pPr>
             <w:r>
@@ -2072,7 +2072,7 @@
           </w:p>
           <w:p>
             <w:pPr>
-              <w:spacing w:before="40" w:after="60" w:line="288" w:lineRule="auto"/>
+              <w:spacing w:before="60" w:after="100" w:line="324" w:lineRule="auto"/>
               <w:jc w:val="left"/>
             </w:pPr>
             <w:r>
@@ -2087,7 +2087,7 @@
           </w:p>
           <w:p>
             <w:pPr>
-              <w:spacing w:before="40" w:after="60" w:line="288" w:lineRule="auto"/>
+              <w:spacing w:before="60" w:after="100" w:line="324" w:lineRule="auto"/>
               <w:jc w:val="left"/>
             </w:pPr>
             <w:r>
@@ -2114,7 +2114,7 @@
           </w:tcPr>
           <w:p>
             <w:pPr>
-              <w:spacing w:before="40" w:after="60" w:line="288" w:lineRule="auto"/>
+              <w:spacing w:before="60" w:after="100" w:line="324" w:lineRule="auto"/>
               <w:jc w:val="left"/>
             </w:pPr>
             <w:r>
@@ -2129,7 +2129,7 @@
           </w:p>
           <w:p>
             <w:pPr>
-              <w:spacing w:before="40" w:after="60" w:line="288" w:lineRule="auto"/>
+              <w:spacing w:before="60" w:after="100" w:line="324" w:lineRule="auto"/>
               <w:jc w:val="left"/>
             </w:pPr>
             <w:r>
@@ -2144,7 +2144,7 @@
           </w:p>
           <w:p>
             <w:pPr>
-              <w:spacing w:before="40" w:after="60" w:line="288" w:lineRule="auto"/>
+              <w:spacing w:before="60" w:after="100" w:line="324" w:lineRule="auto"/>
               <w:jc w:val="left"/>
             </w:pPr>
             <w:r>
@@ -2171,7 +2171,7 @@
           </w:tcPr>
           <w:p>
             <w:pPr>
-              <w:spacing w:before="40" w:after="60" w:line="288" w:lineRule="auto"/>
+              <w:spacing w:before="60" w:after="100" w:line="324" w:lineRule="auto"/>
               <w:jc w:val="left"/>
             </w:pPr>
             <w:r>
@@ -2326,7 +2326,7 @@
           </w:p>
           <w:p>
             <w:pPr>
-              <w:spacing w:before="40" w:after="60" w:line="288" w:lineRule="auto"/>
+              <w:spacing w:before="60" w:after="100" w:line="324" w:lineRule="auto"/>
               <w:jc w:val="left"/>
             </w:pPr>
             <w:r>
@@ -2341,7 +2341,7 @@
           </w:p>
           <w:p>
             <w:pPr>
-              <w:spacing w:before="40" w:after="60" w:line="288" w:lineRule="auto"/>
+              <w:spacing w:before="60" w:after="100" w:line="324" w:lineRule="auto"/>
               <w:jc w:val="left"/>
             </w:pPr>
             <w:r>
@@ -2543,7 +2543,7 @@
           </w:tcPr>
           <w:p>
             <w:pPr>
-              <w:spacing w:before="40" w:after="60" w:line="288" w:lineRule="auto"/>
+              <w:spacing w:before="60" w:after="100" w:line="324" w:lineRule="auto"/>
               <w:jc w:val="center"/>
             </w:pPr>
             <w:r>
@@ -2570,7 +2570,7 @@
           </w:tcPr>
           <w:p>
             <w:pPr>
-              <w:spacing w:before="40" w:after="60" w:line="288" w:lineRule="auto"/>
+              <w:spacing w:before="60" w:after="100" w:line="324" w:lineRule="auto"/>
               <w:jc w:val="center"/>
             </w:pPr>
             <w:r>
@@ -2597,7 +2597,7 @@
           </w:tcPr>
           <w:p>
             <w:pPr>
-              <w:spacing w:before="40" w:after="60" w:line="288" w:lineRule="auto"/>
+              <w:spacing w:before="60" w:after="100" w:line="324" w:lineRule="auto"/>
               <w:jc w:val="center"/>
             </w:pPr>
             <w:r>
@@ -2624,7 +2624,7 @@
           </w:tcPr>
           <w:p>
             <w:pPr>
-              <w:spacing w:before="40" w:after="60" w:line="288" w:lineRule="auto"/>
+              <w:spacing w:before="60" w:after="100" w:line="324" w:lineRule="auto"/>
               <w:jc w:val="center"/>
             </w:pPr>
             <w:r>
@@ -2651,7 +2651,7 @@
           </w:tcPr>
           <w:p>
             <w:pPr>
-              <w:spacing w:before="40" w:after="60" w:line="288" w:lineRule="auto"/>
+              <w:spacing w:before="60" w:after="100" w:line="324" w:lineRule="auto"/>
               <w:jc w:val="center"/>
             </w:pPr>
             <w:r>
@@ -2680,7 +2680,7 @@
           </w:tcPr>
           <w:p>
             <w:pPr>
-              <w:spacing w:before="40" w:after="60" w:line="288" w:lineRule="auto"/>
+              <w:spacing w:before="60" w:after="100" w:line="324" w:lineRule="auto"/>
               <w:jc w:val="center"/>
             </w:pPr>
             <w:r>
@@ -2695,7 +2695,7 @@
           </w:p>
           <w:p>
             <w:pPr>
-              <w:spacing w:before="40" w:after="60" w:line="288" w:lineRule="auto"/>
+              <w:spacing w:before="60" w:after="100" w:line="324" w:lineRule="auto"/>
               <w:jc w:val="center"/>
             </w:pPr>
             <w:r>
@@ -2722,7 +2722,7 @@
           </w:tcPr>
           <w:p>
             <w:pPr>
-              <w:spacing w:before="40" w:after="60" w:line="288" w:lineRule="auto"/>
+              <w:spacing w:before="60" w:after="100" w:line="324" w:lineRule="auto"/>
               <w:jc w:val="center"/>
             </w:pPr>
             <w:r>
@@ -2737,7 +2737,7 @@
           </w:p>
           <w:p>
             <w:pPr>
-              <w:spacing w:before="40" w:after="60" w:line="288" w:lineRule="auto"/>
+              <w:spacing w:before="60" w:after="100" w:line="324" w:lineRule="auto"/>
               <w:jc w:val="center"/>
             </w:pPr>
             <w:r>
@@ -2764,7 +2764,7 @@
           </w:tcPr>
           <w:p>
             <w:pPr>
-              <w:spacing w:before="40" w:after="60" w:line="288" w:lineRule="auto"/>
+              <w:spacing w:before="60" w:after="100" w:line="324" w:lineRule="auto"/>
               <w:jc w:val="left"/>
             </w:pPr>
             <w:r>
@@ -2779,7 +2779,7 @@
           </w:p>
           <w:p>
             <w:pPr>
-              <w:spacing w:before="40" w:after="60" w:line="288" w:lineRule="auto"/>
+              <w:spacing w:before="60" w:after="100" w:line="324" w:lineRule="auto"/>
               <w:jc w:val="left"/>
             </w:pPr>
             <w:r>
@@ -2806,7 +2806,7 @@
           </w:tcPr>
           <w:p>
             <w:pPr>
-              <w:spacing w:before="40" w:after="60" w:line="288" w:lineRule="auto"/>
+              <w:spacing w:before="60" w:after="100" w:line="324" w:lineRule="auto"/>
               <w:jc w:val="left"/>
             </w:pPr>
             <w:r>
@@ -2821,7 +2821,7 @@
           </w:p>
           <w:p>
             <w:pPr>
-              <w:spacing w:before="40" w:after="60" w:line="288" w:lineRule="auto"/>
+              <w:spacing w:before="60" w:after="100" w:line="324" w:lineRule="auto"/>
               <w:jc w:val="left"/>
             </w:pPr>
             <w:r>
@@ -2848,7 +2848,7 @@
           </w:tcPr>
           <w:p>
             <w:pPr>
-              <w:spacing w:before="40" w:after="60" w:line="288" w:lineRule="auto"/>
+              <w:spacing w:before="60" w:after="100" w:line="324" w:lineRule="auto"/>
               <w:jc w:val="left"/>
             </w:pPr>
             <w:r>
@@ -2863,7 +2863,7 @@
           </w:p>
           <w:p>
             <w:pPr>
-              <w:spacing w:before="40" w:after="60" w:line="288" w:lineRule="auto"/>
+              <w:spacing w:before="60" w:after="100" w:line="324" w:lineRule="auto"/>
               <w:jc w:val="left"/>
             </w:pPr>
             <w:r>
@@ -2878,7 +2878,7 @@
           </w:p>
           <w:p>
             <w:pPr>
-              <w:spacing w:before="40" w:after="60" w:line="288" w:lineRule="auto"/>
+              <w:spacing w:before="60" w:after="100" w:line="324" w:lineRule="auto"/>
               <w:jc w:val="left"/>
             </w:pPr>
             <w:r>
@@ -2907,7 +2907,7 @@
           </w:tcPr>
           <w:p>
             <w:pPr>
-              <w:spacing w:before="40" w:after="60" w:line="288" w:lineRule="auto"/>
+              <w:spacing w:before="60" w:after="100" w:line="324" w:lineRule="auto"/>
               <w:jc w:val="center"/>
             </w:pPr>
             <w:r>
@@ -2922,7 +2922,7 @@
           </w:p>
           <w:p>
             <w:pPr>
-              <w:spacing w:before="40" w:after="60" w:line="288" w:lineRule="auto"/>
+              <w:spacing w:before="60" w:after="100" w:line="324" w:lineRule="auto"/>
               <w:jc w:val="center"/>
             </w:pPr>
             <w:r>
@@ -2949,7 +2949,7 @@
           </w:tcPr>
           <w:p>
             <w:pPr>
-              <w:spacing w:before="40" w:after="60" w:line="288" w:lineRule="auto"/>
+              <w:spacing w:before="60" w:after="100" w:line="324" w:lineRule="auto"/>
               <w:jc w:val="center"/>
             </w:pPr>
             <w:r>
@@ -2964,7 +2964,7 @@
           </w:p>
           <w:p>
             <w:pPr>
-              <w:spacing w:before="40" w:after="60" w:line="288" w:lineRule="auto"/>
+              <w:spacing w:before="60" w:after="100" w:line="324" w:lineRule="auto"/>
               <w:jc w:val="center"/>
             </w:pPr>
             <w:r>
@@ -2991,7 +2991,7 @@
           </w:tcPr>
           <w:p>
             <w:pPr>
-              <w:spacing w:before="40" w:after="60" w:line="288" w:lineRule="auto"/>
+              <w:spacing w:before="60" w:after="100" w:line="324" w:lineRule="auto"/>
               <w:jc w:val="left"/>
             </w:pPr>
             <w:r>
@@ -3006,7 +3006,7 @@
           </w:p>
           <w:p>
             <w:pPr>
-              <w:spacing w:before="40" w:after="60" w:line="288" w:lineRule="auto"/>
+              <w:spacing w:before="60" w:after="100" w:line="324" w:lineRule="auto"/>
               <w:jc w:val="left"/>
             </w:pPr>
             <w:r>
@@ -3091,7 +3091,7 @@
           </w:p>
           <w:p>
             <w:pPr>
-              <w:spacing w:before="40" w:after="60" w:line="288" w:lineRule="auto"/>
+              <w:spacing w:before="60" w:after="100" w:line="324" w:lineRule="auto"/>
               <w:jc w:val="left"/>
             </w:pPr>
             <w:r>
@@ -3176,7 +3176,7 @@
           </w:p>
           <w:p>
             <w:pPr>
-              <w:spacing w:before="40" w:after="60" w:line="288" w:lineRule="auto"/>
+              <w:spacing w:before="60" w:after="100" w:line="324" w:lineRule="auto"/>
               <w:jc w:val="left"/>
             </w:pPr>
             <w:r>
@@ -3261,7 +3261,7 @@
           </w:p>
           <w:p>
             <w:pPr>
-              <w:spacing w:before="40" w:after="60" w:line="288" w:lineRule="auto"/>
+              <w:spacing w:before="60" w:after="100" w:line="324" w:lineRule="auto"/>
               <w:jc w:val="left"/>
             </w:pPr>
             <w:r>
@@ -3288,7 +3288,7 @@
           </w:tcPr>
           <w:p>
             <w:pPr>
-              <w:spacing w:before="40" w:after="60" w:line="288" w:lineRule="auto"/>
+              <w:spacing w:before="60" w:after="100" w:line="324" w:lineRule="auto"/>
               <w:jc w:val="left"/>
             </w:pPr>
             <w:r>
@@ -3303,7 +3303,7 @@
           </w:p>
           <w:p>
             <w:pPr>
-              <w:spacing w:before="40" w:after="60" w:line="288" w:lineRule="auto"/>
+              <w:spacing w:before="60" w:after="100" w:line="324" w:lineRule="auto"/>
               <w:jc w:val="left"/>
             </w:pPr>
             <w:r>
@@ -3330,7 +3330,7 @@
           </w:tcPr>
           <w:p>
             <w:pPr>
-              <w:spacing w:before="40" w:after="60" w:line="288" w:lineRule="auto"/>
+              <w:spacing w:before="60" w:after="100" w:line="324" w:lineRule="auto"/>
               <w:jc w:val="left"/>
             </w:pPr>
             <w:r>
@@ -3345,7 +3345,7 @@
           </w:p>
           <w:p>
             <w:pPr>
-              <w:spacing w:before="40" w:after="60" w:line="288" w:lineRule="auto"/>
+              <w:spacing w:before="60" w:after="100" w:line="324" w:lineRule="auto"/>
               <w:jc w:val="left"/>
             </w:pPr>
             <w:r>
@@ -3360,7 +3360,7 @@
           </w:p>
           <w:p>
             <w:pPr>
-              <w:spacing w:before="40" w:after="60" w:line="288" w:lineRule="auto"/>
+              <w:spacing w:before="60" w:after="100" w:line="324" w:lineRule="auto"/>
               <w:jc w:val="left"/>
             </w:pPr>
             <w:r>
@@ -3389,7 +3389,7 @@
           </w:tcPr>
           <w:p>
             <w:pPr>
-              <w:spacing w:before="40" w:after="60" w:line="288" w:lineRule="auto"/>
+              <w:spacing w:before="60" w:after="100" w:line="324" w:lineRule="auto"/>
               <w:jc w:val="center"/>
             </w:pPr>
             <w:r>
@@ -3404,7 +3404,7 @@
           </w:p>
           <w:p>
             <w:pPr>
-              <w:spacing w:before="40" w:after="60" w:line="288" w:lineRule="auto"/>
+              <w:spacing w:before="60" w:after="100" w:line="324" w:lineRule="auto"/>
               <w:jc w:val="center"/>
             </w:pPr>
             <w:r>
@@ -3431,7 +3431,7 @@
           </w:tcPr>
           <w:p>
             <w:pPr>
-              <w:spacing w:before="40" w:after="60" w:line="288" w:lineRule="auto"/>
+              <w:spacing w:before="60" w:after="100" w:line="324" w:lineRule="auto"/>
               <w:jc w:val="center"/>
             </w:pPr>
             <w:r>
@@ -3446,7 +3446,7 @@
           </w:p>
           <w:p>
             <w:pPr>
-              <w:spacing w:before="40" w:after="60" w:line="288" w:lineRule="auto"/>
+              <w:spacing w:before="60" w:after="100" w:line="324" w:lineRule="auto"/>
               <w:jc w:val="center"/>
             </w:pPr>
             <w:r>
@@ -3473,7 +3473,7 @@
           </w:tcPr>
           <w:p>
             <w:pPr>
-              <w:spacing w:before="40" w:after="60" w:line="288" w:lineRule="auto"/>
+              <w:spacing w:before="60" w:after="100" w:line="324" w:lineRule="auto"/>
               <w:jc w:val="left"/>
             </w:pPr>
             <w:r>
@@ -3502,7 +3502,7 @@
           </w:p>
           <w:p>
             <w:pPr>
-              <w:spacing w:before="40" w:after="60" w:line="288" w:lineRule="auto"/>
+              <w:spacing w:before="60" w:after="100" w:line="324" w:lineRule="auto"/>
               <w:jc w:val="left"/>
             </w:pPr>
             <w:r>
@@ -3531,7 +3531,7 @@
           </w:p>
           <w:p>
             <w:pPr>
-              <w:spacing w:before="40" w:after="60" w:line="288" w:lineRule="auto"/>
+              <w:spacing w:before="60" w:after="100" w:line="324" w:lineRule="auto"/>
               <w:jc w:val="left"/>
             </w:pPr>
             <w:r>
@@ -3560,7 +3560,7 @@
           </w:p>
           <w:p>
             <w:pPr>
-              <w:spacing w:before="40" w:after="60" w:line="288" w:lineRule="auto"/>
+              <w:spacing w:before="60" w:after="100" w:line="324" w:lineRule="auto"/>
               <w:jc w:val="left"/>
             </w:pPr>
             <w:r>
@@ -3619,7 +3619,7 @@
           </w:p>
           <w:p>
             <w:pPr>
-              <w:spacing w:before="40" w:after="60" w:line="288" w:lineRule="auto"/>
+              <w:spacing w:before="60" w:after="100" w:line="324" w:lineRule="auto"/>
               <w:jc w:val="left"/>
             </w:pPr>
             <w:r>
@@ -3660,7 +3660,7 @@
           </w:tcPr>
           <w:p>
             <w:pPr>
-              <w:spacing w:before="40" w:after="60" w:line="288" w:lineRule="auto"/>
+              <w:spacing w:before="60" w:after="100" w:line="324" w:lineRule="auto"/>
               <w:jc w:val="left"/>
             </w:pPr>
             <w:r>
@@ -3675,7 +3675,7 @@
           </w:p>
           <w:p>
             <w:pPr>
-              <w:spacing w:before="40" w:after="60" w:line="288" w:lineRule="auto"/>
+              <w:spacing w:before="60" w:after="100" w:line="324" w:lineRule="auto"/>
               <w:jc w:val="left"/>
             </w:pPr>
             <w:r>
@@ -3702,7 +3702,7 @@
           </w:tcPr>
           <w:p>
             <w:pPr>
-              <w:spacing w:before="40" w:after="60" w:line="288" w:lineRule="auto"/>
+              <w:spacing w:before="60" w:after="100" w:line="324" w:lineRule="auto"/>
               <w:jc w:val="left"/>
             </w:pPr>
             <w:r>
@@ -3717,7 +3717,7 @@
           </w:p>
           <w:p>
             <w:pPr>
-              <w:spacing w:before="40" w:after="60" w:line="288" w:lineRule="auto"/>
+              <w:spacing w:before="60" w:after="100" w:line="324" w:lineRule="auto"/>
               <w:jc w:val="left"/>
             </w:pPr>
             <w:r>
@@ -3732,7 +3732,7 @@
           </w:p>
           <w:p>
             <w:pPr>
-              <w:spacing w:before="40" w:after="60" w:line="288" w:lineRule="auto"/>
+              <w:spacing w:before="60" w:after="100" w:line="324" w:lineRule="auto"/>
               <w:jc w:val="left"/>
             </w:pPr>
             <w:r>
@@ -3761,7 +3761,7 @@
           </w:tcPr>
           <w:p>
             <w:pPr>
-              <w:spacing w:before="40" w:after="60" w:line="288" w:lineRule="auto"/>
+              <w:spacing w:before="60" w:after="100" w:line="324" w:lineRule="auto"/>
               <w:jc w:val="center"/>
             </w:pPr>
             <w:r>
@@ -3776,7 +3776,7 @@
           </w:p>
           <w:p>
             <w:pPr>
-              <w:spacing w:before="40" w:after="60" w:line="288" w:lineRule="auto"/>
+              <w:spacing w:before="60" w:after="100" w:line="324" w:lineRule="auto"/>
               <w:jc w:val="center"/>
             </w:pPr>
             <w:r>
@@ -3803,7 +3803,7 @@
           </w:tcPr>
           <w:p>
             <w:pPr>
-              <w:spacing w:before="40" w:after="60" w:line="288" w:lineRule="auto"/>
+              <w:spacing w:before="60" w:after="100" w:line="324" w:lineRule="auto"/>
               <w:jc w:val="center"/>
             </w:pPr>
             <w:r>
@@ -3818,7 +3818,7 @@
           </w:p>
           <w:p>
             <w:pPr>
-              <w:spacing w:before="40" w:after="60" w:line="288" w:lineRule="auto"/>
+              <w:spacing w:before="60" w:after="100" w:line="324" w:lineRule="auto"/>
               <w:jc w:val="center"/>
             </w:pPr>
             <w:r>
@@ -3845,7 +3845,7 @@
           </w:tcPr>
           <w:p>
             <w:pPr>
-              <w:spacing w:before="40" w:after="60" w:line="288" w:lineRule="auto"/>
+              <w:spacing w:before="60" w:after="100" w:line="324" w:lineRule="auto"/>
               <w:jc w:val="left"/>
             </w:pPr>
             <w:r>
@@ -3895,7 +3895,7 @@
           </w:p>
           <w:p>
             <w:pPr>
-              <w:spacing w:before="40" w:after="60" w:line="288" w:lineRule="auto"/>
+              <w:spacing w:before="60" w:after="100" w:line="324" w:lineRule="auto"/>
               <w:jc w:val="left"/>
             </w:pPr>
             <w:r>
@@ -3945,7 +3945,7 @@
           </w:p>
           <w:p>
             <w:pPr>
-              <w:spacing w:before="40" w:after="60" w:line="288" w:lineRule="auto"/>
+              <w:spacing w:before="60" w:after="100" w:line="324" w:lineRule="auto"/>
               <w:jc w:val="left"/>
             </w:pPr>
             <w:r>
@@ -4016,7 +4016,7 @@
           </w:p>
           <w:p>
             <w:pPr>
-              <w:spacing w:before="40" w:after="60" w:line="288" w:lineRule="auto"/>
+              <w:spacing w:before="60" w:after="100" w:line="324" w:lineRule="auto"/>
               <w:jc w:val="left"/>
             </w:pPr>
             <w:r>
@@ -4174,7 +4174,7 @@
           </w:p>
           <w:p>
             <w:pPr>
-              <w:spacing w:before="40" w:after="60" w:line="288" w:lineRule="auto"/>
+              <w:spacing w:before="60" w:after="100" w:line="324" w:lineRule="auto"/>
               <w:jc w:val="left"/>
             </w:pPr>
             <w:r>
@@ -4236,7 +4236,7 @@
           </w:tcPr>
           <w:p>
             <w:pPr>
-              <w:spacing w:before="40" w:after="60" w:line="288" w:lineRule="auto"/>
+              <w:spacing w:before="60" w:after="100" w:line="324" w:lineRule="auto"/>
               <w:jc w:val="left"/>
             </w:pPr>
             <w:r>
@@ -4265,7 +4265,7 @@
           </w:p>
           <w:p>
             <w:pPr>
-              <w:spacing w:before="40" w:after="60" w:line="288" w:lineRule="auto"/>
+              <w:spacing w:before="60" w:after="100" w:line="324" w:lineRule="auto"/>
               <w:jc w:val="left"/>
             </w:pPr>
             <w:r>
@@ -4306,7 +4306,7 @@
           </w:tcPr>
           <w:p>
             <w:pPr>
-              <w:spacing w:before="40" w:after="60" w:line="288" w:lineRule="auto"/>
+              <w:spacing w:before="60" w:after="100" w:line="324" w:lineRule="auto"/>
               <w:jc w:val="left"/>
             </w:pPr>
             <w:r>
@@ -4321,7 +4321,7 @@
           </w:p>
           <w:p>
             <w:pPr>
-              <w:spacing w:before="40" w:after="60" w:line="288" w:lineRule="auto"/>
+              <w:spacing w:before="60" w:after="100" w:line="324" w:lineRule="auto"/>
               <w:jc w:val="left"/>
             </w:pPr>
             <w:r>
@@ -4336,7 +4336,7 @@
           </w:p>
           <w:p>
             <w:pPr>
-              <w:spacing w:before="40" w:after="60" w:line="288" w:lineRule="auto"/>
+              <w:spacing w:before="60" w:after="100" w:line="324" w:lineRule="auto"/>
               <w:jc w:val="left"/>
             </w:pPr>
             <w:r>
@@ -4365,7 +4365,7 @@
           </w:tcPr>
           <w:p>
             <w:pPr>
-              <w:spacing w:before="40" w:after="60" w:line="288" w:lineRule="auto"/>
+              <w:spacing w:before="60" w:after="100" w:line="324" w:lineRule="auto"/>
               <w:jc w:val="center"/>
             </w:pPr>
             <w:r>
@@ -4380,7 +4380,7 @@
           </w:p>
           <w:p>
             <w:pPr>
-              <w:spacing w:before="40" w:after="60" w:line="288" w:lineRule="auto"/>
+              <w:spacing w:before="60" w:after="100" w:line="324" w:lineRule="auto"/>
               <w:jc w:val="center"/>
             </w:pPr>
             <w:r>
@@ -4407,7 +4407,7 @@
           </w:tcPr>
           <w:p>
             <w:pPr>
-              <w:spacing w:before="40" w:after="60" w:line="288" w:lineRule="auto"/>
+              <w:spacing w:before="60" w:after="100" w:line="324" w:lineRule="auto"/>
               <w:jc w:val="center"/>
             </w:pPr>
             <w:r>
@@ -4422,7 +4422,7 @@
           </w:p>
           <w:p>
             <w:pPr>
-              <w:spacing w:before="40" w:after="60" w:line="288" w:lineRule="auto"/>
+              <w:spacing w:before="60" w:after="100" w:line="324" w:lineRule="auto"/>
               <w:jc w:val="center"/>
             </w:pPr>
             <w:r>
@@ -4449,7 +4449,7 @@
           </w:tcPr>
           <w:p>
             <w:pPr>
-              <w:spacing w:before="40" w:after="60" w:line="288" w:lineRule="auto"/>
+              <w:spacing w:before="60" w:after="100" w:line="324" w:lineRule="auto"/>
               <w:jc w:val="left"/>
             </w:pPr>
             <w:r>
@@ -4464,7 +4464,7 @@
           </w:p>
           <w:p>
             <w:pPr>
-              <w:spacing w:before="40" w:after="60" w:line="288" w:lineRule="auto"/>
+              <w:spacing w:before="60" w:after="100" w:line="324" w:lineRule="auto"/>
               <w:jc w:val="left"/>
             </w:pPr>
             <w:r>
@@ -4544,7 +4544,7 @@
           </w:tcPr>
           <w:p>
             <w:pPr>
-              <w:spacing w:before="40" w:after="60" w:line="288" w:lineRule="auto"/>
+              <w:spacing w:before="60" w:after="100" w:line="324" w:lineRule="auto"/>
               <w:jc w:val="left"/>
             </w:pPr>
             <w:r>
@@ -4559,7 +4559,7 @@
           </w:p>
           <w:p>
             <w:pPr>
-              <w:spacing w:before="40" w:after="60" w:line="288" w:lineRule="auto"/>
+              <w:spacing w:before="60" w:after="100" w:line="324" w:lineRule="auto"/>
               <w:jc w:val="left"/>
             </w:pPr>
             <w:r>
@@ -4586,7 +4586,7 @@
           </w:tcPr>
           <w:p>
             <w:pPr>
-              <w:spacing w:before="40" w:after="60" w:line="288" w:lineRule="auto"/>
+              <w:spacing w:before="60" w:after="100" w:line="324" w:lineRule="auto"/>
               <w:jc w:val="left"/>
             </w:pPr>
             <w:r>
@@ -4601,7 +4601,7 @@
           </w:p>
           <w:p>
             <w:pPr>
-              <w:spacing w:before="40" w:after="60" w:line="288" w:lineRule="auto"/>
+              <w:spacing w:before="60" w:after="100" w:line="324" w:lineRule="auto"/>
               <w:jc w:val="left"/>
             </w:pPr>
             <w:r>
@@ -4764,7 +4764,7 @@
           </w:tcPr>
           <w:p>
             <w:pPr>
-              <w:spacing w:before="40" w:after="60" w:line="288" w:lineRule="auto"/>
+              <w:spacing w:before="60" w:after="100" w:line="324" w:lineRule="auto"/>
               <w:jc w:val="center"/>
             </w:pPr>
             <w:r>
@@ -4791,7 +4791,7 @@
           </w:tcPr>
           <w:p>
             <w:pPr>
-              <w:spacing w:before="40" w:after="60" w:line="288" w:lineRule="auto"/>
+              <w:spacing w:before="60" w:after="100" w:line="324" w:lineRule="auto"/>
               <w:jc w:val="center"/>
             </w:pPr>
             <w:r>
@@ -4818,7 +4818,7 @@
           </w:tcPr>
           <w:p>
             <w:pPr>
-              <w:spacing w:before="40" w:after="60" w:line="288" w:lineRule="auto"/>
+              <w:spacing w:before="60" w:after="100" w:line="324" w:lineRule="auto"/>
               <w:jc w:val="center"/>
             </w:pPr>
             <w:r>
@@ -4845,7 +4845,7 @@
           </w:tcPr>
           <w:p>
             <w:pPr>
-              <w:spacing w:before="40" w:after="60" w:line="288" w:lineRule="auto"/>
+              <w:spacing w:before="60" w:after="100" w:line="324" w:lineRule="auto"/>
               <w:jc w:val="center"/>
             </w:pPr>
             <w:r>
@@ -4872,7 +4872,7 @@
           </w:tcPr>
           <w:p>
             <w:pPr>
-              <w:spacing w:before="40" w:after="60" w:line="288" w:lineRule="auto"/>
+              <w:spacing w:before="60" w:after="100" w:line="324" w:lineRule="auto"/>
               <w:jc w:val="center"/>
             </w:pPr>
             <w:r>
@@ -4901,7 +4901,7 @@
           </w:tcPr>
           <w:p>
             <w:pPr>
-              <w:spacing w:before="40" w:after="60" w:line="288" w:lineRule="auto"/>
+              <w:spacing w:before="60" w:after="100" w:line="324" w:lineRule="auto"/>
               <w:jc w:val="center"/>
             </w:pPr>
             <w:r>
@@ -4916,7 +4916,7 @@
           </w:p>
           <w:p>
             <w:pPr>
-              <w:spacing w:before="40" w:after="60" w:line="288" w:lineRule="auto"/>
+              <w:spacing w:before="60" w:after="100" w:line="324" w:lineRule="auto"/>
               <w:jc w:val="center"/>
             </w:pPr>
             <w:r>
@@ -4943,7 +4943,7 @@
           </w:tcPr>
           <w:p>
             <w:pPr>
-              <w:spacing w:before="40" w:after="60" w:line="288" w:lineRule="auto"/>
+              <w:spacing w:before="60" w:after="100" w:line="324" w:lineRule="auto"/>
               <w:jc w:val="center"/>
             </w:pPr>
             <w:r>
@@ -4958,7 +4958,7 @@
           </w:p>
           <w:p>
             <w:pPr>
-              <w:spacing w:before="40" w:after="60" w:line="288" w:lineRule="auto"/>
+              <w:spacing w:before="60" w:after="100" w:line="324" w:lineRule="auto"/>
               <w:jc w:val="center"/>
             </w:pPr>
             <w:r>
@@ -4985,7 +4985,7 @@
           </w:tcPr>
           <w:p>
             <w:pPr>
-              <w:spacing w:before="40" w:after="60" w:line="288" w:lineRule="auto"/>
+              <w:spacing w:before="60" w:after="100" w:line="324" w:lineRule="auto"/>
               <w:jc w:val="left"/>
             </w:pPr>
             <w:r>
@@ -5075,7 +5075,7 @@
           </w:p>
           <w:p>
             <w:pPr>
-              <w:spacing w:before="40" w:after="60" w:line="288" w:lineRule="auto"/>
+              <w:spacing w:before="60" w:after="100" w:line="324" w:lineRule="auto"/>
               <w:jc w:val="left"/>
             </w:pPr>
             <w:r>
@@ -5202,7 +5202,7 @@
           </w:p>
           <w:p>
             <w:pPr>
-              <w:spacing w:before="40" w:after="60" w:line="288" w:lineRule="auto"/>
+              <w:spacing w:before="60" w:after="100" w:line="324" w:lineRule="auto"/>
               <w:jc w:val="left"/>
             </w:pPr>
             <w:r>
@@ -5229,7 +5229,7 @@
           </w:tcPr>
           <w:p>
             <w:pPr>
-              <w:spacing w:before="40" w:after="60" w:line="288" w:lineRule="auto"/>
+              <w:spacing w:before="60" w:after="100" w:line="324" w:lineRule="auto"/>
               <w:jc w:val="left"/>
             </w:pPr>
             <w:r>
@@ -5244,7 +5244,7 @@
           </w:p>
           <w:p>
             <w:pPr>
-              <w:spacing w:before="40" w:after="60" w:line="288" w:lineRule="auto"/>
+              <w:spacing w:before="60" w:after="100" w:line="324" w:lineRule="auto"/>
               <w:jc w:val="left"/>
             </w:pPr>
             <w:r>
@@ -5271,7 +5271,7 @@
           </w:tcPr>
           <w:p>
             <w:pPr>
-              <w:spacing w:before="40" w:after="60" w:line="288" w:lineRule="auto"/>
+              <w:spacing w:before="60" w:after="100" w:line="324" w:lineRule="auto"/>
               <w:jc w:val="left"/>
             </w:pPr>
             <w:r>
@@ -5286,7 +5286,7 @@
           </w:p>
           <w:p>
             <w:pPr>
-              <w:spacing w:before="40" w:after="60" w:line="288" w:lineRule="auto"/>
+              <w:spacing w:before="60" w:after="100" w:line="324" w:lineRule="auto"/>
               <w:jc w:val="left"/>
             </w:pPr>
             <w:r>
@@ -5301,7 +5301,7 @@
           </w:p>
           <w:p>
             <w:pPr>
-              <w:spacing w:before="40" w:after="60" w:line="288" w:lineRule="auto"/>
+              <w:spacing w:before="60" w:after="100" w:line="324" w:lineRule="auto"/>
               <w:jc w:val="left"/>
             </w:pPr>
             <w:r>
@@ -5330,7 +5330,7 @@
           </w:tcPr>
           <w:p>
             <w:pPr>
-              <w:spacing w:before="40" w:after="60" w:line="288" w:lineRule="auto"/>
+              <w:spacing w:before="60" w:after="100" w:line="324" w:lineRule="auto"/>
               <w:jc w:val="center"/>
             </w:pPr>
             <w:r>
@@ -5345,7 +5345,7 @@
           </w:p>
           <w:p>
             <w:pPr>
-              <w:spacing w:before="40" w:after="60" w:line="288" w:lineRule="auto"/>
+              <w:spacing w:before="60" w:after="100" w:line="324" w:lineRule="auto"/>
               <w:jc w:val="center"/>
             </w:pPr>
             <w:r>
@@ -5372,7 +5372,7 @@
           </w:tcPr>
           <w:p>
             <w:pPr>
-              <w:spacing w:before="40" w:after="60" w:line="288" w:lineRule="auto"/>
+              <w:spacing w:before="60" w:after="100" w:line="324" w:lineRule="auto"/>
               <w:jc w:val="center"/>
             </w:pPr>
             <w:r>
@@ -5387,7 +5387,7 @@
           </w:p>
           <w:p>
             <w:pPr>
-              <w:spacing w:before="40" w:after="60" w:line="288" w:lineRule="auto"/>
+              <w:spacing w:before="60" w:after="100" w:line="324" w:lineRule="auto"/>
               <w:jc w:val="center"/>
             </w:pPr>
             <w:r>
@@ -5414,7 +5414,7 @@
           </w:tcPr>
           <w:p>
             <w:pPr>
-              <w:spacing w:before="40" w:after="60" w:line="288" w:lineRule="auto"/>
+              <w:spacing w:before="60" w:after="100" w:line="324" w:lineRule="auto"/>
               <w:jc w:val="left"/>
             </w:pPr>
             <w:r>
@@ -5539,7 +5539,7 @@
           </w:p>
           <w:p>
             <w:pPr>
-              <w:spacing w:before="40" w:after="60" w:line="288" w:lineRule="auto"/>
+              <w:spacing w:before="60" w:after="100" w:line="324" w:lineRule="auto"/>
               <w:jc w:val="left"/>
             </w:pPr>
             <w:r>
@@ -5661,7 +5661,7 @@
           </w:p>
           <w:p>
             <w:pPr>
-              <w:spacing w:before="40" w:after="60" w:line="288" w:lineRule="auto"/>
+              <w:spacing w:before="60" w:after="100" w:line="324" w:lineRule="auto"/>
               <w:jc w:val="left"/>
             </w:pPr>
             <w:r>
@@ -5815,7 +5815,7 @@
           </w:tcPr>
           <w:p>
             <w:pPr>
-              <w:spacing w:before="40" w:after="60" w:line="288" w:lineRule="auto"/>
+              <w:spacing w:before="60" w:after="100" w:line="324" w:lineRule="auto"/>
               <w:jc w:val="left"/>
             </w:pPr>
             <w:r>
@@ -5830,7 +5830,7 @@
           </w:p>
           <w:p>
             <w:pPr>
-              <w:spacing w:before="40" w:after="60" w:line="288" w:lineRule="auto"/>
+              <w:spacing w:before="60" w:after="100" w:line="324" w:lineRule="auto"/>
               <w:jc w:val="left"/>
             </w:pPr>
             <w:r>
@@ -5915,7 +5915,7 @@
           </w:tcPr>
           <w:p>
             <w:pPr>
-              <w:spacing w:before="40" w:after="60" w:line="288" w:lineRule="auto"/>
+              <w:spacing w:before="60" w:after="100" w:line="324" w:lineRule="auto"/>
               <w:jc w:val="left"/>
             </w:pPr>
             <w:r>
@@ -5930,7 +5930,7 @@
           </w:p>
           <w:p>
             <w:pPr>
-              <w:spacing w:before="40" w:after="60" w:line="288" w:lineRule="auto"/>
+              <w:spacing w:before="60" w:after="100" w:line="324" w:lineRule="auto"/>
               <w:jc w:val="left"/>
             </w:pPr>
             <w:r>
@@ -5945,7 +5945,7 @@
           </w:p>
           <w:p>
             <w:pPr>
-              <w:spacing w:before="40" w:after="60" w:line="288" w:lineRule="auto"/>
+              <w:spacing w:before="60" w:after="100" w:line="324" w:lineRule="auto"/>
               <w:jc w:val="left"/>
             </w:pPr>
             <w:r>
@@ -5974,7 +5974,7 @@
           </w:tcPr>
           <w:p>
             <w:pPr>
-              <w:spacing w:before="40" w:after="60" w:line="288" w:lineRule="auto"/>
+              <w:spacing w:before="60" w:after="100" w:line="324" w:lineRule="auto"/>
               <w:jc w:val="center"/>
             </w:pPr>
             <w:r>
@@ -5989,7 +5989,7 @@
           </w:p>
           <w:p>
             <w:pPr>
-              <w:spacing w:before="40" w:after="60" w:line="288" w:lineRule="auto"/>
+              <w:spacing w:before="60" w:after="100" w:line="324" w:lineRule="auto"/>
               <w:jc w:val="center"/>
             </w:pPr>
             <w:r>
@@ -6016,7 +6016,7 @@
           </w:tcPr>
           <w:p>
             <w:pPr>
-              <w:spacing w:before="40" w:after="60" w:line="288" w:lineRule="auto"/>
+              <w:spacing w:before="60" w:after="100" w:line="324" w:lineRule="auto"/>
               <w:jc w:val="center"/>
             </w:pPr>
             <w:r>
@@ -6031,7 +6031,7 @@
           </w:p>
           <w:p>
             <w:pPr>
-              <w:spacing w:before="40" w:after="60" w:line="288" w:lineRule="auto"/>
+              <w:spacing w:before="60" w:after="100" w:line="324" w:lineRule="auto"/>
               <w:jc w:val="center"/>
             </w:pPr>
             <w:r>
@@ -6058,7 +6058,7 @@
           </w:tcPr>
           <w:p>
             <w:pPr>
-              <w:spacing w:before="40" w:after="60" w:line="288" w:lineRule="auto"/>
+              <w:spacing w:before="60" w:after="100" w:line="324" w:lineRule="auto"/>
               <w:jc w:val="left"/>
             </w:pPr>
             <w:r>
@@ -6073,7 +6073,7 @@
           </w:p>
           <w:p>
             <w:pPr>
-              <w:spacing w:before="40" w:after="60" w:line="288" w:lineRule="auto"/>
+              <w:spacing w:before="60" w:after="100" w:line="324" w:lineRule="auto"/>
               <w:jc w:val="left"/>
             </w:pPr>
             <w:r>
@@ -6129,7 +6129,7 @@
           </w:p>
           <w:p>
             <w:pPr>
-              <w:spacing w:before="40" w:after="60" w:line="288" w:lineRule="auto"/>
+              <w:spacing w:before="60" w:after="100" w:line="324" w:lineRule="auto"/>
               <w:jc w:val="left"/>
             </w:pPr>
             <w:r>
@@ -6258,7 +6258,7 @@
           </w:p>
           <w:p>
             <w:pPr>
-              <w:spacing w:before="40" w:after="60" w:line="288" w:lineRule="auto"/>
+              <w:spacing w:before="60" w:after="100" w:line="324" w:lineRule="auto"/>
               <w:jc w:val="left"/>
             </w:pPr>
             <w:r>
@@ -6331,7 +6331,7 @@
           </w:tcPr>
           <w:p>
             <w:pPr>
-              <w:spacing w:before="40" w:after="60" w:line="288" w:lineRule="auto"/>
+              <w:spacing w:before="60" w:after="100" w:line="324" w:lineRule="auto"/>
               <w:jc w:val="left"/>
             </w:pPr>
             <w:r>
@@ -6346,7 +6346,7 @@
           </w:p>
           <w:p>
             <w:pPr>
-              <w:spacing w:before="40" w:after="60" w:line="288" w:lineRule="auto"/>
+              <w:spacing w:before="60" w:after="100" w:line="324" w:lineRule="auto"/>
               <w:jc w:val="left"/>
             </w:pPr>
             <w:r>
@@ -6373,7 +6373,7 @@
           </w:tcPr>
           <w:p>
             <w:pPr>
-              <w:spacing w:before="40" w:after="60" w:line="288" w:lineRule="auto"/>
+              <w:spacing w:before="60" w:after="100" w:line="324" w:lineRule="auto"/>
               <w:jc w:val="left"/>
             </w:pPr>
             <w:r>
@@ -6388,7 +6388,7 @@
           </w:p>
           <w:p>
             <w:pPr>
-              <w:spacing w:before="40" w:after="60" w:line="288" w:lineRule="auto"/>
+              <w:spacing w:before="60" w:after="100" w:line="324" w:lineRule="auto"/>
               <w:jc w:val="left"/>
             </w:pPr>
             <w:r>
@@ -6403,7 +6403,7 @@
           </w:p>
           <w:p>
             <w:pPr>
-              <w:spacing w:before="40" w:after="60" w:line="288" w:lineRule="auto"/>
+              <w:spacing w:before="60" w:after="100" w:line="324" w:lineRule="auto"/>
               <w:jc w:val="left"/>
             </w:pPr>
             <w:r>
@@ -6432,7 +6432,7 @@
           </w:tcPr>
           <w:p>
             <w:pPr>
-              <w:spacing w:before="40" w:after="60" w:line="288" w:lineRule="auto"/>
+              <w:spacing w:before="60" w:after="100" w:line="324" w:lineRule="auto"/>
               <w:jc w:val="center"/>
             </w:pPr>
             <w:r>
@@ -6447,7 +6447,7 @@
           </w:p>
           <w:p>
             <w:pPr>
-              <w:spacing w:before="40" w:after="60" w:line="288" w:lineRule="auto"/>
+              <w:spacing w:before="60" w:after="100" w:line="324" w:lineRule="auto"/>
               <w:jc w:val="center"/>
             </w:pPr>
             <w:r>
@@ -6474,7 +6474,7 @@
           </w:tcPr>
           <w:p>
             <w:pPr>
-              <w:spacing w:before="40" w:after="60" w:line="288" w:lineRule="auto"/>
+              <w:spacing w:before="60" w:after="100" w:line="324" w:lineRule="auto"/>
               <w:jc w:val="center"/>
             </w:pPr>
             <w:r>
@@ -6489,7 +6489,7 @@
           </w:p>
           <w:p>
             <w:pPr>
-              <w:spacing w:before="40" w:after="60" w:line="288" w:lineRule="auto"/>
+              <w:spacing w:before="60" w:after="100" w:line="324" w:lineRule="auto"/>
               <w:jc w:val="center"/>
             </w:pPr>
             <w:r>
@@ -6516,7 +6516,7 @@
           </w:tcPr>
           <w:p>
             <w:pPr>
-              <w:spacing w:before="40" w:after="60" w:line="288" w:lineRule="auto"/>
+              <w:spacing w:before="60" w:after="100" w:line="324" w:lineRule="auto"/>
               <w:jc w:val="left"/>
             </w:pPr>
             <w:r>
@@ -6531,7 +6531,7 @@
           </w:p>
           <w:p>
             <w:pPr>
-              <w:spacing w:before="40" w:after="60" w:line="288" w:lineRule="auto"/>
+              <w:spacing w:before="60" w:after="100" w:line="324" w:lineRule="auto"/>
               <w:jc w:val="left"/>
             </w:pPr>
             <w:r>
@@ -6612,7 +6612,7 @@
           </w:p>
           <w:p>
             <w:pPr>
-              <w:spacing w:before="40" w:after="60" w:line="288" w:lineRule="auto"/>
+              <w:spacing w:before="60" w:after="100" w:line="324" w:lineRule="auto"/>
               <w:jc w:val="left"/>
             </w:pPr>
             <w:r>
@@ -6627,7 +6627,7 @@
           </w:p>
           <w:p>
             <w:pPr>
-              <w:spacing w:before="40" w:after="60" w:line="288" w:lineRule="auto"/>
+              <w:spacing w:before="60" w:after="100" w:line="324" w:lineRule="auto"/>
               <w:jc w:val="left"/>
             </w:pPr>
             <w:r>
@@ -6654,7 +6654,7 @@
           </w:tcPr>
           <w:p>
             <w:pPr>
-              <w:spacing w:before="40" w:after="60" w:line="288" w:lineRule="auto"/>
+              <w:spacing w:before="60" w:after="100" w:line="324" w:lineRule="auto"/>
               <w:jc w:val="left"/>
             </w:pPr>
             <w:r>
@@ -6669,7 +6669,7 @@
           </w:p>
           <w:p>
             <w:pPr>
-              <w:spacing w:before="40" w:after="60" w:line="288" w:lineRule="auto"/>
+              <w:spacing w:before="60" w:after="100" w:line="324" w:lineRule="auto"/>
               <w:jc w:val="left"/>
             </w:pPr>
             <w:r>
@@ -6819,7 +6819,7 @@
           </w:p>
           <w:p>
             <w:pPr>
-              <w:spacing w:before="40" w:after="60" w:line="288" w:lineRule="auto"/>
+              <w:spacing w:before="60" w:after="100" w:line="324" w:lineRule="auto"/>
               <w:jc w:val="left"/>
             </w:pPr>
             <w:r>
@@ -6846,7 +6846,7 @@
           </w:tcPr>
           <w:p>
             <w:pPr>
-              <w:spacing w:before="40" w:after="60" w:line="288" w:lineRule="auto"/>
+              <w:spacing w:before="60" w:after="100" w:line="324" w:lineRule="auto"/>
               <w:jc w:val="left"/>
             </w:pPr>
             <w:r>
@@ -6861,7 +6861,7 @@
           </w:p>
           <w:p>
             <w:pPr>
-              <w:spacing w:before="40" w:after="60" w:line="288" w:lineRule="auto"/>
+              <w:spacing w:before="60" w:after="100" w:line="324" w:lineRule="auto"/>
               <w:jc w:val="left"/>
             </w:pPr>
             <w:r>
@@ -6876,7 +6876,7 @@
           </w:p>
           <w:p>
             <w:pPr>
-              <w:spacing w:before="40" w:after="60" w:line="288" w:lineRule="auto"/>
+              <w:spacing w:before="60" w:after="100" w:line="324" w:lineRule="auto"/>
               <w:jc w:val="left"/>
             </w:pPr>
             <w:r>
@@ -6905,7 +6905,7 @@
           </w:tcPr>
           <w:p>
             <w:pPr>
-              <w:spacing w:before="40" w:after="60" w:line="288" w:lineRule="auto"/>
+              <w:spacing w:before="60" w:after="100" w:line="324" w:lineRule="auto"/>
               <w:jc w:val="center"/>
             </w:pPr>
             <w:r>
@@ -6920,7 +6920,7 @@
           </w:p>
           <w:p>
             <w:pPr>
-              <w:spacing w:before="40" w:after="60" w:line="288" w:lineRule="auto"/>
+              <w:spacing w:before="60" w:after="100" w:line="324" w:lineRule="auto"/>
               <w:jc w:val="center"/>
             </w:pPr>
             <w:r>
@@ -6947,7 +6947,7 @@
           </w:tcPr>
           <w:p>
             <w:pPr>
-              <w:spacing w:before="40" w:after="60" w:line="288" w:lineRule="auto"/>
+              <w:spacing w:before="60" w:after="100" w:line="324" w:lineRule="auto"/>
               <w:jc w:val="center"/>
             </w:pPr>
             <w:r>
@@ -6974,7 +6974,7 @@
           </w:tcPr>
           <w:p>
             <w:pPr>
-              <w:spacing w:before="40" w:after="60" w:line="288" w:lineRule="auto"/>
+              <w:spacing w:before="60" w:after="100" w:line="324" w:lineRule="auto"/>
               <w:jc w:val="left"/>
             </w:pPr>
             <w:r>
@@ -7011,7 +7011,7 @@
           </w:p>
           <w:p>
             <w:pPr>
-              <w:spacing w:before="40" w:after="60" w:line="288" w:lineRule="auto"/>
+              <w:spacing w:before="60" w:after="100" w:line="324" w:lineRule="auto"/>
               <w:jc w:val="left"/>
             </w:pPr>
             <w:r>
@@ -7038,7 +7038,7 @@
           </w:tcPr>
           <w:p>
             <w:pPr>
-              <w:spacing w:before="40" w:after="60" w:line="288" w:lineRule="auto"/>
+              <w:spacing w:before="60" w:after="100" w:line="324" w:lineRule="auto"/>
               <w:jc w:val="left"/>
             </w:pPr>
             <w:r>
@@ -7053,7 +7053,7 @@
           </w:p>
           <w:p>
             <w:pPr>
-              <w:spacing w:before="40" w:after="60" w:line="288" w:lineRule="auto"/>
+              <w:spacing w:before="60" w:after="100" w:line="324" w:lineRule="auto"/>
               <w:jc w:val="left"/>
             </w:pPr>
             <w:r>
@@ -7080,7 +7080,7 @@
           </w:tcPr>
           <w:p>
             <w:pPr>
-              <w:spacing w:before="40" w:after="60" w:line="288" w:lineRule="auto"/>
+              <w:spacing w:before="60" w:after="100" w:line="324" w:lineRule="auto"/>
               <w:jc w:val="left"/>
             </w:pPr>
             <w:r>
@@ -7189,7 +7189,7 @@
           </w:tcPr>
           <w:p>
             <w:pPr>
-              <w:spacing w:before="40" w:after="60" w:line="288" w:lineRule="auto"/>
+              <w:spacing w:before="60" w:after="100" w:line="324" w:lineRule="auto"/>
               <w:jc w:val="center"/>
             </w:pPr>
             <w:r>
@@ -7216,7 +7216,7 @@
           </w:tcPr>
           <w:p>
             <w:pPr>
-              <w:spacing w:before="40" w:after="60" w:line="288" w:lineRule="auto"/>
+              <w:spacing w:before="60" w:after="100" w:line="324" w:lineRule="auto"/>
               <w:jc w:val="center"/>
             </w:pPr>
             <w:r>
@@ -7243,7 +7243,7 @@
           </w:tcPr>
           <w:p>
             <w:pPr>
-              <w:spacing w:before="40" w:after="60" w:line="288" w:lineRule="auto"/>
+              <w:spacing w:before="60" w:after="100" w:line="324" w:lineRule="auto"/>
               <w:jc w:val="center"/>
             </w:pPr>
             <w:r>
@@ -7270,7 +7270,7 @@
           </w:tcPr>
           <w:p>
             <w:pPr>
-              <w:spacing w:before="40" w:after="60" w:line="288" w:lineRule="auto"/>
+              <w:spacing w:before="60" w:after="100" w:line="324" w:lineRule="auto"/>
               <w:jc w:val="center"/>
             </w:pPr>
             <w:r>
@@ -7297,7 +7297,7 @@
           </w:tcPr>
           <w:p>
             <w:pPr>
-              <w:spacing w:before="40" w:after="60" w:line="288" w:lineRule="auto"/>
+              <w:spacing w:before="60" w:after="100" w:line="324" w:lineRule="auto"/>
               <w:jc w:val="center"/>
             </w:pPr>
             <w:r>
@@ -7326,7 +7326,7 @@
           </w:tcPr>
           <w:p>
             <w:pPr>
-              <w:spacing w:before="40" w:after="60" w:line="288" w:lineRule="auto"/>
+              <w:spacing w:before="60" w:after="100" w:line="324" w:lineRule="auto"/>
               <w:jc w:val="center"/>
             </w:pPr>
             <w:r>
@@ -7341,7 +7341,7 @@
           </w:p>
           <w:p>
             <w:pPr>
-              <w:spacing w:before="40" w:after="60" w:line="288" w:lineRule="auto"/>
+              <w:spacing w:before="60" w:after="100" w:line="324" w:lineRule="auto"/>
               <w:jc w:val="center"/>
             </w:pPr>
             <w:r>
@@ -7368,7 +7368,7 @@
           </w:tcPr>
           <w:p>
             <w:pPr>
-              <w:spacing w:before="40" w:after="60" w:line="288" w:lineRule="auto"/>
+              <w:spacing w:before="60" w:after="100" w:line="324" w:lineRule="auto"/>
               <w:jc w:val="center"/>
             </w:pPr>
             <w:r>
@@ -7383,7 +7383,7 @@
           </w:p>
           <w:p>
             <w:pPr>
-              <w:spacing w:before="40" w:after="60" w:line="288" w:lineRule="auto"/>
+              <w:spacing w:before="60" w:after="100" w:line="324" w:lineRule="auto"/>
               <w:jc w:val="center"/>
             </w:pPr>
             <w:r>
@@ -7410,7 +7410,7 @@
           </w:tcPr>
           <w:p>
             <w:pPr>
-              <w:spacing w:before="40" w:after="60" w:line="288" w:lineRule="auto"/>
+              <w:spacing w:before="60" w:after="100" w:line="324" w:lineRule="auto"/>
               <w:jc w:val="left"/>
             </w:pPr>
             <w:r>
@@ -7425,7 +7425,7 @@
           </w:p>
           <w:p>
             <w:pPr>
-              <w:spacing w:before="40" w:after="60" w:line="288" w:lineRule="auto"/>
+              <w:spacing w:before="60" w:after="100" w:line="324" w:lineRule="auto"/>
               <w:jc w:val="left"/>
             </w:pPr>
             <w:r>
@@ -7542,7 +7542,7 @@
           </w:p>
           <w:p>
             <w:pPr>
-              <w:spacing w:before="40" w:after="60" w:line="288" w:lineRule="auto"/>
+              <w:spacing w:before="60" w:after="100" w:line="324" w:lineRule="auto"/>
               <w:jc w:val="left"/>
             </w:pPr>
             <w:r>
@@ -7557,7 +7557,7 @@
           </w:p>
           <w:p>
             <w:pPr>
-              <w:spacing w:before="40" w:after="60" w:line="288" w:lineRule="auto"/>
+              <w:spacing w:before="60" w:after="100" w:line="324" w:lineRule="auto"/>
               <w:jc w:val="left"/>
             </w:pPr>
             <w:r>
@@ -7749,7 +7749,7 @@
           </w:p>
           <w:p>
             <w:pPr>
-              <w:spacing w:before="40" w:after="60" w:line="288" w:lineRule="auto"/>
+              <w:spacing w:before="60" w:after="100" w:line="324" w:lineRule="auto"/>
               <w:jc w:val="left"/>
             </w:pPr>
             <w:r>
@@ -7838,7 +7838,7 @@
           </w:tcPr>
           <w:p>
             <w:pPr>
-              <w:spacing w:before="40" w:after="60" w:line="288" w:lineRule="auto"/>
+              <w:spacing w:before="60" w:after="100" w:line="324" w:lineRule="auto"/>
               <w:jc w:val="left"/>
             </w:pPr>
             <w:r>
@@ -7853,7 +7853,7 @@
           </w:p>
           <w:p>
             <w:pPr>
-              <w:spacing w:before="40" w:after="60" w:line="288" w:lineRule="auto"/>
+              <w:spacing w:before="60" w:after="100" w:line="324" w:lineRule="auto"/>
               <w:jc w:val="left"/>
             </w:pPr>
             <w:r>
@@ -7880,7 +7880,7 @@
           </w:tcPr>
           <w:p>
             <w:pPr>
-              <w:spacing w:before="40" w:after="60" w:line="288" w:lineRule="auto"/>
+              <w:spacing w:before="60" w:after="100" w:line="324" w:lineRule="auto"/>
               <w:jc w:val="left"/>
             </w:pPr>
             <w:r>
@@ -7895,7 +7895,7 @@
           </w:p>
           <w:p>
             <w:pPr>
-              <w:spacing w:before="40" w:after="60" w:line="288" w:lineRule="auto"/>
+              <w:spacing w:before="60" w:after="100" w:line="324" w:lineRule="auto"/>
               <w:jc w:val="left"/>
             </w:pPr>
             <w:r>
@@ -7910,7 +7910,7 @@
           </w:p>
           <w:p>
             <w:pPr>
-              <w:spacing w:before="40" w:after="60" w:line="288" w:lineRule="auto"/>
+              <w:spacing w:before="60" w:after="100" w:line="324" w:lineRule="auto"/>
               <w:jc w:val="left"/>
             </w:pPr>
             <w:r>
@@ -7939,7 +7939,7 @@
           </w:tcPr>
           <w:p>
             <w:pPr>
-              <w:spacing w:before="40" w:after="60" w:line="288" w:lineRule="auto"/>
+              <w:spacing w:before="60" w:after="100" w:line="324" w:lineRule="auto"/>
               <w:jc w:val="center"/>
             </w:pPr>
             <w:r>
@@ -7954,7 +7954,7 @@
           </w:p>
           <w:p>
             <w:pPr>
-              <w:spacing w:before="40" w:after="60" w:line="288" w:lineRule="auto"/>
+              <w:spacing w:before="60" w:after="100" w:line="324" w:lineRule="auto"/>
               <w:jc w:val="center"/>
             </w:pPr>
             <w:r>
@@ -7981,7 +7981,7 @@
           </w:tcPr>
           <w:p>
             <w:pPr>
-              <w:spacing w:before="40" w:after="60" w:line="288" w:lineRule="auto"/>
+              <w:spacing w:before="60" w:after="100" w:line="324" w:lineRule="auto"/>
               <w:jc w:val="center"/>
             </w:pPr>
             <w:r>
@@ -7996,7 +7996,7 @@
           </w:p>
           <w:p>
             <w:pPr>
-              <w:spacing w:before="40" w:after="60" w:line="288" w:lineRule="auto"/>
+              <w:spacing w:before="60" w:after="100" w:line="324" w:lineRule="auto"/>
               <w:jc w:val="center"/>
             </w:pPr>
             <w:r>
@@ -8023,7 +8023,7 @@
           </w:tcPr>
           <w:p>
             <w:pPr>
-              <w:spacing w:before="40" w:after="60" w:line="288" w:lineRule="auto"/>
+              <w:spacing w:before="60" w:after="100" w:line="324" w:lineRule="auto"/>
               <w:jc w:val="left"/>
             </w:pPr>
             <w:r>
@@ -8038,7 +8038,7 @@
           </w:p>
           <w:p>
             <w:pPr>
-              <w:spacing w:before="40" w:after="60" w:line="288" w:lineRule="auto"/>
+              <w:spacing w:before="60" w:after="100" w:line="324" w:lineRule="auto"/>
               <w:jc w:val="left"/>
             </w:pPr>
             <w:r>
@@ -8106,7 +8106,7 @@
           </w:p>
           <w:p>
             <w:pPr>
-              <w:spacing w:before="40" w:after="60" w:line="288" w:lineRule="auto"/>
+              <w:spacing w:before="60" w:after="100" w:line="324" w:lineRule="auto"/>
               <w:jc w:val="left"/>
             </w:pPr>
             <w:r>
@@ -8192,7 +8192,7 @@
           </w:p>
           <w:p>
             <w:pPr>
-              <w:spacing w:before="40" w:after="60" w:line="288" w:lineRule="auto"/>
+              <w:spacing w:before="60" w:after="100" w:line="324" w:lineRule="auto"/>
               <w:jc w:val="left"/>
             </w:pPr>
             <w:r>
@@ -8349,7 +8349,7 @@
           </w:p>
           <w:p>
             <w:pPr>
-              <w:spacing w:before="40" w:after="60" w:line="288" w:lineRule="auto"/>
+              <w:spacing w:before="60" w:after="100" w:line="324" w:lineRule="auto"/>
               <w:jc w:val="left"/>
             </w:pPr>
             <w:r>
@@ -8462,7 +8462,7 @@
           </w:tcPr>
           <w:p>
             <w:pPr>
-              <w:spacing w:before="40" w:after="60" w:line="288" w:lineRule="auto"/>
+              <w:spacing w:before="60" w:after="100" w:line="324" w:lineRule="auto"/>
               <w:jc w:val="left"/>
             </w:pPr>
             <w:r>
@@ -8477,7 +8477,7 @@
           </w:p>
           <w:p>
             <w:pPr>
-              <w:spacing w:before="40" w:after="60" w:line="288" w:lineRule="auto"/>
+              <w:spacing w:before="60" w:after="100" w:line="324" w:lineRule="auto"/>
               <w:jc w:val="left"/>
             </w:pPr>
             <w:r>
@@ -8504,7 +8504,7 @@
           </w:tcPr>
           <w:p>
             <w:pPr>
-              <w:spacing w:before="40" w:after="60" w:line="288" w:lineRule="auto"/>
+              <w:spacing w:before="60" w:after="100" w:line="324" w:lineRule="auto"/>
               <w:jc w:val="left"/>
             </w:pPr>
             <w:r>
@@ -8519,7 +8519,7 @@
           </w:p>
           <w:p>
             <w:pPr>
-              <w:spacing w:before="40" w:after="60" w:line="288" w:lineRule="auto"/>
+              <w:spacing w:before="60" w:after="100" w:line="324" w:lineRule="auto"/>
               <w:jc w:val="left"/>
             </w:pPr>
             <w:r>
@@ -8534,7 +8534,7 @@
           </w:p>
           <w:p>
             <w:pPr>
-              <w:spacing w:before="40" w:after="60" w:line="288" w:lineRule="auto"/>
+              <w:spacing w:before="60" w:after="100" w:line="324" w:lineRule="auto"/>
               <w:jc w:val="left"/>
             </w:pPr>
             <w:r>
@@ -8563,7 +8563,7 @@
           </w:tcPr>
           <w:p>
             <w:pPr>
-              <w:spacing w:before="40" w:after="60" w:line="288" w:lineRule="auto"/>
+              <w:spacing w:before="60" w:after="100" w:line="324" w:lineRule="auto"/>
               <w:jc w:val="center"/>
             </w:pPr>
             <w:r>
@@ -8578,7 +8578,7 @@
           </w:p>
           <w:p>
             <w:pPr>
-              <w:spacing w:before="40" w:after="60" w:line="288" w:lineRule="auto"/>
+              <w:spacing w:before="60" w:after="100" w:line="324" w:lineRule="auto"/>
               <w:jc w:val="center"/>
             </w:pPr>
             <w:r>
@@ -8605,7 +8605,7 @@
           </w:tcPr>
           <w:p>
             <w:pPr>
-              <w:spacing w:before="40" w:after="60" w:line="288" w:lineRule="auto"/>
+              <w:spacing w:before="60" w:after="100" w:line="324" w:lineRule="auto"/>
               <w:jc w:val="center"/>
             </w:pPr>
             <w:r>
@@ -8620,7 +8620,7 @@
           </w:p>
           <w:p>
             <w:pPr>
-              <w:spacing w:before="40" w:after="60" w:line="288" w:lineRule="auto"/>
+              <w:spacing w:before="60" w:after="100" w:line="324" w:lineRule="auto"/>
               <w:jc w:val="center"/>
             </w:pPr>
             <w:r>
@@ -8647,7 +8647,7 @@
           </w:tcPr>
           <w:p>
             <w:pPr>
-              <w:spacing w:before="40" w:after="60" w:line="288" w:lineRule="auto"/>
+              <w:spacing w:before="60" w:after="100" w:line="324" w:lineRule="auto"/>
               <w:jc w:val="left"/>
             </w:pPr>
             <w:r>
@@ -8662,7 +8662,7 @@
           </w:p>
           <w:p>
             <w:pPr>
-              <w:spacing w:before="40" w:after="60" w:line="288" w:lineRule="auto"/>
+              <w:spacing w:before="60" w:after="100" w:line="324" w:lineRule="auto"/>
               <w:jc w:val="left"/>
             </w:pPr>
             <w:r>
@@ -8769,7 +8769,7 @@
           </w:p>
           <w:p>
             <w:pPr>
-              <w:spacing w:before="40" w:after="60" w:line="288" w:lineRule="auto"/>
+              <w:spacing w:before="60" w:after="100" w:line="324" w:lineRule="auto"/>
               <w:jc w:val="left"/>
             </w:pPr>
             <w:r>
@@ -8807,7 +8807,7 @@
           </w:p>
           <w:p>
             <w:pPr>
-              <w:spacing w:before="40" w:after="60" w:line="288" w:lineRule="auto"/>
+              <w:spacing w:before="60" w:after="100" w:line="324" w:lineRule="auto"/>
               <w:jc w:val="left"/>
             </w:pPr>
             <w:r>
@@ -8914,7 +8914,7 @@
           </w:p>
           <w:p>
             <w:pPr>
-              <w:spacing w:before="40" w:after="60" w:line="288" w:lineRule="auto"/>
+              <w:spacing w:before="60" w:after="100" w:line="324" w:lineRule="auto"/>
               <w:jc w:val="left"/>
             </w:pPr>
             <w:r>
@@ -9042,7 +9042,7 @@
           </w:p>
           <w:p>
             <w:pPr>
-              <w:spacing w:before="40" w:after="60" w:line="288" w:lineRule="auto"/>
+              <w:spacing w:before="60" w:after="100" w:line="324" w:lineRule="auto"/>
               <w:jc w:val="left"/>
             </w:pPr>
             <w:r>
@@ -9083,7 +9083,7 @@
           </w:tcPr>
           <w:p>
             <w:pPr>
-              <w:spacing w:before="40" w:after="60" w:line="288" w:lineRule="auto"/>
+              <w:spacing w:before="60" w:after="100" w:line="324" w:lineRule="auto"/>
               <w:jc w:val="left"/>
             </w:pPr>
             <w:r>
@@ -9121,7 +9121,7 @@
           </w:p>
           <w:p>
             <w:pPr>
-              <w:spacing w:before="40" w:after="60" w:line="288" w:lineRule="auto"/>
+              <w:spacing w:before="60" w:after="100" w:line="324" w:lineRule="auto"/>
               <w:jc w:val="left"/>
             </w:pPr>
             <w:r>
@@ -9148,7 +9148,7 @@
           </w:tcPr>
           <w:p>
             <w:pPr>
-              <w:spacing w:before="40" w:after="60" w:line="288" w:lineRule="auto"/>
+              <w:spacing w:before="60" w:after="100" w:line="324" w:lineRule="auto"/>
               <w:jc w:val="left"/>
             </w:pPr>
             <w:r>
@@ -9163,7 +9163,7 @@
           </w:p>
           <w:p>
             <w:pPr>
-              <w:spacing w:before="40" w:after="60" w:line="288" w:lineRule="auto"/>
+              <w:spacing w:before="60" w:after="100" w:line="324" w:lineRule="auto"/>
               <w:jc w:val="left"/>
             </w:pPr>
             <w:r>
@@ -9192,7 +9192,7 @@
           </w:tcPr>
           <w:p>
             <w:pPr>
-              <w:spacing w:before="40" w:after="60" w:line="288" w:lineRule="auto"/>
+              <w:spacing w:before="60" w:after="100" w:line="324" w:lineRule="auto"/>
               <w:jc w:val="center"/>
             </w:pPr>
             <w:r>
@@ -9207,7 +9207,7 @@
           </w:p>
           <w:p>
             <w:pPr>
-              <w:spacing w:before="40" w:after="60" w:line="288" w:lineRule="auto"/>
+              <w:spacing w:before="60" w:after="100" w:line="324" w:lineRule="auto"/>
               <w:jc w:val="center"/>
             </w:pPr>
             <w:r>
@@ -9234,7 +9234,7 @@
           </w:tcPr>
           <w:p>
             <w:pPr>
-              <w:spacing w:before="40" w:after="60" w:line="288" w:lineRule="auto"/>
+              <w:spacing w:before="60" w:after="100" w:line="324" w:lineRule="auto"/>
               <w:jc w:val="center"/>
             </w:pPr>
             <w:r>
@@ -9249,7 +9249,7 @@
           </w:p>
           <w:p>
             <w:pPr>
-              <w:spacing w:before="40" w:after="60" w:line="288" w:lineRule="auto"/>
+              <w:spacing w:before="60" w:after="100" w:line="324" w:lineRule="auto"/>
               <w:jc w:val="center"/>
             </w:pPr>
             <w:r>
@@ -9276,7 +9276,7 @@
           </w:tcPr>
           <w:p>
             <w:pPr>
-              <w:spacing w:before="40" w:after="60" w:line="288" w:lineRule="auto"/>
+              <w:spacing w:before="60" w:after="100" w:line="324" w:lineRule="auto"/>
               <w:jc w:val="left"/>
             </w:pPr>
             <w:r>
@@ -9370,7 +9370,7 @@
           </w:p>
           <w:p>
             <w:pPr>
-              <w:spacing w:before="40" w:after="60" w:line="288" w:lineRule="auto"/>
+              <w:spacing w:before="60" w:after="100" w:line="324" w:lineRule="auto"/>
               <w:jc w:val="left"/>
             </w:pPr>
             <w:r>
@@ -9407,7 +9407,7 @@
           </w:p>
           <w:p>
             <w:pPr>
-              <w:spacing w:before="40" w:after="60" w:line="288" w:lineRule="auto"/>
+              <w:spacing w:before="60" w:after="100" w:line="324" w:lineRule="auto"/>
               <w:jc w:val="left"/>
             </w:pPr>
             <w:r>
@@ -9442,7 +9442,7 @@
           </w:p>
           <w:p>
             <w:pPr>
-              <w:spacing w:before="40" w:after="60" w:line="288" w:lineRule="auto"/>
+              <w:spacing w:before="60" w:after="100" w:line="324" w:lineRule="auto"/>
               <w:jc w:val="left"/>
             </w:pPr>
             <w:r>
@@ -9546,7 +9546,7 @@
           </w:tcPr>
           <w:p>
             <w:pPr>
-              <w:spacing w:before="40" w:after="60" w:line="288" w:lineRule="auto"/>
+              <w:spacing w:before="60" w:after="100" w:line="324" w:lineRule="auto"/>
               <w:jc w:val="left"/>
             </w:pPr>
             <w:r>
@@ -9581,7 +9581,7 @@
           </w:p>
           <w:p>
             <w:pPr>
-              <w:spacing w:before="40" w:after="60" w:line="288" w:lineRule="auto"/>
+              <w:spacing w:before="60" w:after="100" w:line="324" w:lineRule="auto"/>
               <w:jc w:val="left"/>
             </w:pPr>
             <w:r>
@@ -9725,7 +9725,7 @@
           </w:tcPr>
           <w:p>
             <w:pPr>
-              <w:spacing w:before="40" w:after="60" w:line="288" w:lineRule="auto"/>
+              <w:spacing w:before="60" w:after="100" w:line="324" w:lineRule="auto"/>
               <w:jc w:val="left"/>
             </w:pPr>
             <w:r>
@@ -9740,7 +9740,7 @@
           </w:p>
           <w:p>
             <w:pPr>
-              <w:spacing w:before="40" w:after="60" w:line="288" w:lineRule="auto"/>
+              <w:spacing w:before="60" w:after="100" w:line="324" w:lineRule="auto"/>
               <w:jc w:val="left"/>
             </w:pPr>
             <w:r>
@@ -9755,7 +9755,7 @@
           </w:p>
           <w:p>
             <w:pPr>
-              <w:spacing w:before="40" w:after="60" w:line="288" w:lineRule="auto"/>
+              <w:spacing w:before="60" w:after="100" w:line="324" w:lineRule="auto"/>
               <w:jc w:val="left"/>
             </w:pPr>
             <w:r>
@@ -9784,7 +9784,7 @@
           </w:tcPr>
           <w:p>
             <w:pPr>
-              <w:spacing w:before="40" w:after="60" w:line="288" w:lineRule="auto"/>
+              <w:spacing w:before="60" w:after="100" w:line="324" w:lineRule="auto"/>
               <w:jc w:val="center"/>
             </w:pPr>
             <w:r>
@@ -9799,7 +9799,7 @@
           </w:p>
           <w:p>
             <w:pPr>
-              <w:spacing w:before="40" w:after="60" w:line="288" w:lineRule="auto"/>
+              <w:spacing w:before="60" w:after="100" w:line="324" w:lineRule="auto"/>
               <w:jc w:val="center"/>
             </w:pPr>
             <w:r>
@@ -9826,7 +9826,7 @@
           </w:tcPr>
           <w:p>
             <w:pPr>
-              <w:spacing w:before="40" w:after="60" w:line="288" w:lineRule="auto"/>
+              <w:spacing w:before="60" w:after="100" w:line="324" w:lineRule="auto"/>
               <w:jc w:val="center"/>
             </w:pPr>
             <w:r>
@@ -9853,7 +9853,7 @@
           </w:tcPr>
           <w:p>
             <w:pPr>
-              <w:spacing w:before="40" w:after="60" w:line="288" w:lineRule="auto"/>
+              <w:spacing w:before="60" w:after="100" w:line="324" w:lineRule="auto"/>
               <w:jc w:val="left"/>
             </w:pPr>
             <w:r>
@@ -9868,7 +9868,7 @@
           </w:p>
           <w:p>
             <w:pPr>
-              <w:spacing w:before="40" w:after="60" w:line="288" w:lineRule="auto"/>
+              <w:spacing w:before="60" w:after="100" w:line="324" w:lineRule="auto"/>
               <w:jc w:val="left"/>
             </w:pPr>
             <w:r>
@@ -9895,7 +9895,7 @@
           </w:tcPr>
           <w:p>
             <w:pPr>
-              <w:spacing w:before="40" w:after="60" w:line="288" w:lineRule="auto"/>
+              <w:spacing w:before="60" w:after="100" w:line="324" w:lineRule="auto"/>
               <w:jc w:val="left"/>
             </w:pPr>
             <w:r>
@@ -9910,7 +9910,7 @@
           </w:p>
           <w:p>
             <w:pPr>
-              <w:spacing w:before="40" w:after="60" w:line="288" w:lineRule="auto"/>
+              <w:spacing w:before="60" w:after="100" w:line="324" w:lineRule="auto"/>
               <w:jc w:val="left"/>
             </w:pPr>
             <w:r>
@@ -9937,7 +9937,7 @@
           </w:tcPr>
           <w:p>
             <w:pPr>
-              <w:spacing w:before="40" w:after="60" w:line="288" w:lineRule="auto"/>
+              <w:spacing w:before="60" w:after="100" w:line="324" w:lineRule="auto"/>
               <w:jc w:val="left"/>
             </w:pPr>
             <w:r>
@@ -10161,7 +10161,7 @@
           </w:tcPr>
           <w:p>
             <w:pPr>
-              <w:spacing w:before="40" w:after="60" w:line="288" w:lineRule="auto"/>
+              <w:spacing w:before="60" w:after="100" w:line="324" w:lineRule="auto"/>
               <w:jc w:val="center"/>
             </w:pPr>
             <w:r>
@@ -10188,7 +10188,7 @@
           </w:tcPr>
           <w:p>
             <w:pPr>
-              <w:spacing w:before="40" w:after="60" w:line="288" w:lineRule="auto"/>
+              <w:spacing w:before="60" w:after="100" w:line="324" w:lineRule="auto"/>
               <w:jc w:val="center"/>
             </w:pPr>
             <w:r>
@@ -10215,7 +10215,7 @@
           </w:tcPr>
           <w:p>
             <w:pPr>
-              <w:spacing w:before="40" w:after="60" w:line="288" w:lineRule="auto"/>
+              <w:spacing w:before="60" w:after="100" w:line="324" w:lineRule="auto"/>
               <w:jc w:val="center"/>
             </w:pPr>
             <w:r>
@@ -10242,7 +10242,7 @@
           </w:tcPr>
           <w:p>
             <w:pPr>
-              <w:spacing w:before="40" w:after="60" w:line="288" w:lineRule="auto"/>
+              <w:spacing w:before="60" w:after="100" w:line="324" w:lineRule="auto"/>
               <w:jc w:val="center"/>
             </w:pPr>
             <w:r>
@@ -10269,7 +10269,7 @@
           </w:tcPr>
           <w:p>
             <w:pPr>
-              <w:spacing w:before="40" w:after="60" w:line="288" w:lineRule="auto"/>
+              <w:spacing w:before="60" w:after="100" w:line="324" w:lineRule="auto"/>
               <w:jc w:val="center"/>
             </w:pPr>
             <w:r>
@@ -10298,7 +10298,7 @@
           </w:tcPr>
           <w:p>
             <w:pPr>
-              <w:spacing w:before="40" w:after="60" w:line="288" w:lineRule="auto"/>
+              <w:spacing w:before="60" w:after="100" w:line="324" w:lineRule="auto"/>
               <w:jc w:val="center"/>
             </w:pPr>
             <w:r>
@@ -10313,7 +10313,7 @@
           </w:p>
           <w:p>
             <w:pPr>
-              <w:spacing w:before="40" w:after="60" w:line="288" w:lineRule="auto"/>
+              <w:spacing w:before="60" w:after="100" w:line="324" w:lineRule="auto"/>
               <w:jc w:val="center"/>
             </w:pPr>
             <w:r>
@@ -10340,7 +10340,7 @@
           </w:tcPr>
           <w:p>
             <w:pPr>
-              <w:spacing w:before="40" w:after="60" w:line="288" w:lineRule="auto"/>
+              <w:spacing w:before="60" w:after="100" w:line="324" w:lineRule="auto"/>
               <w:jc w:val="center"/>
             </w:pPr>
             <w:r>
@@ -10355,7 +10355,7 @@
           </w:p>
           <w:p>
             <w:pPr>
-              <w:spacing w:before="40" w:after="60" w:line="288" w:lineRule="auto"/>
+              <w:spacing w:before="60" w:after="100" w:line="324" w:lineRule="auto"/>
               <w:jc w:val="center"/>
             </w:pPr>
             <w:r>
@@ -10382,7 +10382,7 @@
           </w:tcPr>
           <w:p>
             <w:pPr>
-              <w:spacing w:before="40" w:after="60" w:line="288" w:lineRule="auto"/>
+              <w:spacing w:before="60" w:after="100" w:line="324" w:lineRule="auto"/>
               <w:jc w:val="left"/>
             </w:pPr>
             <w:r>
@@ -10397,7 +10397,7 @@
           </w:p>
           <w:p>
             <w:pPr>
-              <w:spacing w:before="40" w:after="60" w:line="288" w:lineRule="auto"/>
+              <w:spacing w:before="60" w:after="100" w:line="324" w:lineRule="auto"/>
               <w:jc w:val="left"/>
             </w:pPr>
             <w:r>
@@ -10493,7 +10493,7 @@
           </w:p>
           <w:p>
             <w:pPr>
-              <w:spacing w:before="40" w:after="60" w:line="288" w:lineRule="auto"/>
+              <w:spacing w:before="60" w:after="100" w:line="324" w:lineRule="auto"/>
               <w:jc w:val="left"/>
             </w:pPr>
             <w:r>
@@ -10693,7 +10693,7 @@
           </w:p>
           <w:p>
             <w:pPr>
-              <w:spacing w:before="40" w:after="60" w:line="288" w:lineRule="auto"/>
+              <w:spacing w:before="60" w:after="100" w:line="324" w:lineRule="auto"/>
               <w:jc w:val="left"/>
             </w:pPr>
             <w:r>
@@ -10752,7 +10752,7 @@
           </w:p>
           <w:p>
             <w:pPr>
-              <w:spacing w:before="40" w:after="60" w:line="288" w:lineRule="auto"/>
+              <w:spacing w:before="60" w:after="100" w:line="324" w:lineRule="auto"/>
               <w:jc w:val="left"/>
             </w:pPr>
             <w:r>
@@ -10811,7 +10811,7 @@
           </w:p>
           <w:p>
             <w:pPr>
-              <w:spacing w:before="40" w:after="60" w:line="288" w:lineRule="auto"/>
+              <w:spacing w:before="60" w:after="100" w:line="324" w:lineRule="auto"/>
               <w:jc w:val="left"/>
             </w:pPr>
             <w:r>
@@ -10870,7 +10870,7 @@
           </w:p>
           <w:p>
             <w:pPr>
-              <w:spacing w:before="40" w:after="60" w:line="288" w:lineRule="auto"/>
+              <w:spacing w:before="60" w:after="100" w:line="324" w:lineRule="auto"/>
               <w:jc w:val="left"/>
             </w:pPr>
             <w:r>
@@ -10993,7 +10993,7 @@
           </w:tcPr>
           <w:p>
             <w:pPr>
-              <w:spacing w:before="40" w:after="60" w:line="288" w:lineRule="auto"/>
+              <w:spacing w:before="60" w:after="100" w:line="324" w:lineRule="auto"/>
               <w:jc w:val="left"/>
             </w:pPr>
             <w:r>
@@ -11034,7 +11034,7 @@
           </w:p>
           <w:p>
             <w:pPr>
-              <w:spacing w:before="40" w:after="60" w:line="288" w:lineRule="auto"/>
+              <w:spacing w:before="60" w:after="100" w:line="324" w:lineRule="auto"/>
               <w:jc w:val="left"/>
             </w:pPr>
             <w:r>
@@ -11061,7 +11061,7 @@
           </w:tcPr>
           <w:p>
             <w:pPr>
-              <w:spacing w:before="40" w:after="60" w:line="288" w:lineRule="auto"/>
+              <w:spacing w:before="60" w:after="100" w:line="324" w:lineRule="auto"/>
               <w:jc w:val="left"/>
             </w:pPr>
             <w:r>
@@ -11076,7 +11076,7 @@
           </w:p>
           <w:p>
             <w:pPr>
-              <w:spacing w:before="40" w:after="60" w:line="288" w:lineRule="auto"/>
+              <w:spacing w:before="60" w:after="100" w:line="324" w:lineRule="auto"/>
               <w:jc w:val="left"/>
             </w:pPr>
             <w:r>
@@ -11091,7 +11091,7 @@
           </w:p>
           <w:p>
             <w:pPr>
-              <w:spacing w:before="40" w:after="60" w:line="288" w:lineRule="auto"/>
+              <w:spacing w:before="60" w:after="100" w:line="324" w:lineRule="auto"/>
               <w:jc w:val="left"/>
             </w:pPr>
             <w:r>
@@ -11120,7 +11120,7 @@
           </w:tcPr>
           <w:p>
             <w:pPr>
-              <w:spacing w:before="40" w:after="60" w:line="288" w:lineRule="auto"/>
+              <w:spacing w:before="60" w:after="100" w:line="324" w:lineRule="auto"/>
               <w:jc w:val="center"/>
             </w:pPr>
             <w:r>
@@ -11135,7 +11135,7 @@
           </w:p>
           <w:p>
             <w:pPr>
-              <w:spacing w:before="40" w:after="60" w:line="288" w:lineRule="auto"/>
+              <w:spacing w:before="60" w:after="100" w:line="324" w:lineRule="auto"/>
               <w:jc w:val="center"/>
             </w:pPr>
             <w:r>
@@ -11162,7 +11162,7 @@
           </w:tcPr>
           <w:p>
             <w:pPr>
-              <w:spacing w:before="40" w:after="60" w:line="288" w:lineRule="auto"/>
+              <w:spacing w:before="60" w:after="100" w:line="324" w:lineRule="auto"/>
               <w:jc w:val="center"/>
             </w:pPr>
             <w:r>
@@ -11177,7 +11177,7 @@
           </w:p>
           <w:p>
             <w:pPr>
-              <w:spacing w:before="40" w:after="60" w:line="288" w:lineRule="auto"/>
+              <w:spacing w:before="60" w:after="100" w:line="324" w:lineRule="auto"/>
               <w:jc w:val="center"/>
             </w:pPr>
             <w:r>
@@ -11204,7 +11204,7 @@
           </w:tcPr>
           <w:p>
             <w:pPr>
-              <w:spacing w:before="40" w:after="60" w:line="288" w:lineRule="auto"/>
+              <w:spacing w:before="60" w:after="100" w:line="324" w:lineRule="auto"/>
               <w:jc w:val="left"/>
             </w:pPr>
             <w:r>
@@ -11219,7 +11219,7 @@
           </w:p>
           <w:p>
             <w:pPr>
-              <w:spacing w:before="40" w:after="60" w:line="288" w:lineRule="auto"/>
+              <w:spacing w:before="60" w:after="100" w:line="324" w:lineRule="auto"/>
               <w:jc w:val="left"/>
             </w:pPr>
             <w:r>
@@ -11254,7 +11254,7 @@
           </w:p>
           <w:p>
             <w:pPr>
-              <w:spacing w:before="40" w:after="60" w:line="288" w:lineRule="auto"/>
+              <w:spacing w:before="60" w:after="100" w:line="324" w:lineRule="auto"/>
               <w:jc w:val="left"/>
             </w:pPr>
             <w:r>
@@ -11304,7 +11304,7 @@
           </w:p>
           <w:p>
             <w:pPr>
-              <w:spacing w:before="40" w:after="60" w:line="288" w:lineRule="auto"/>
+              <w:spacing w:before="60" w:after="100" w:line="324" w:lineRule="auto"/>
               <w:jc w:val="left"/>
             </w:pPr>
             <w:r>
@@ -11366,7 +11366,7 @@
           </w:p>
           <w:p>
             <w:pPr>
-              <w:spacing w:before="40" w:after="60" w:line="288" w:lineRule="auto"/>
+              <w:spacing w:before="60" w:after="100" w:line="324" w:lineRule="auto"/>
               <w:jc w:val="left"/>
             </w:pPr>
             <w:r>
@@ -11439,7 +11439,7 @@
           </w:p>
           <w:p>
             <w:pPr>
-              <w:spacing w:before="40" w:after="60" w:line="288" w:lineRule="auto"/>
+              <w:spacing w:before="60" w:after="100" w:line="324" w:lineRule="auto"/>
               <w:jc w:val="left"/>
             </w:pPr>
             <w:r>
@@ -11544,7 +11544,7 @@
           </w:p>
           <w:p>
             <w:pPr>
-              <w:spacing w:before="40" w:after="60" w:line="288" w:lineRule="auto"/>
+              <w:spacing w:before="60" w:after="100" w:line="324" w:lineRule="auto"/>
               <w:jc w:val="left"/>
             </w:pPr>
             <w:r>
@@ -11571,7 +11571,7 @@
           </w:tcPr>
           <w:p>
             <w:pPr>
-              <w:spacing w:before="40" w:after="60" w:line="288" w:lineRule="auto"/>
+              <w:spacing w:before="60" w:after="100" w:line="324" w:lineRule="auto"/>
               <w:jc w:val="left"/>
             </w:pPr>
             <w:r>
@@ -11586,7 +11586,7 @@
           </w:p>
           <w:p>
             <w:pPr>
-              <w:spacing w:before="40" w:after="60" w:line="288" w:lineRule="auto"/>
+              <w:spacing w:before="60" w:after="100" w:line="324" w:lineRule="auto"/>
               <w:jc w:val="left"/>
             </w:pPr>
             <w:r>
@@ -11613,7 +11613,7 @@
           </w:tcPr>
           <w:p>
             <w:pPr>
-              <w:spacing w:before="40" w:after="60" w:line="288" w:lineRule="auto"/>
+              <w:spacing w:before="60" w:after="100" w:line="324" w:lineRule="auto"/>
               <w:jc w:val="left"/>
             </w:pPr>
             <w:r>
@@ -11628,7 +11628,7 @@
           </w:p>
           <w:p>
             <w:pPr>
-              <w:spacing w:before="40" w:after="60" w:line="288" w:lineRule="auto"/>
+              <w:spacing w:before="60" w:after="100" w:line="324" w:lineRule="auto"/>
               <w:jc w:val="left"/>
             </w:pPr>
             <w:r>
@@ -11643,7 +11643,7 @@
           </w:p>
           <w:p>
             <w:pPr>
-              <w:spacing w:before="40" w:after="60" w:line="288" w:lineRule="auto"/>
+              <w:spacing w:before="60" w:after="100" w:line="324" w:lineRule="auto"/>
               <w:jc w:val="left"/>
             </w:pPr>
             <w:r>
@@ -11672,7 +11672,7 @@
           </w:tcPr>
           <w:p>
             <w:pPr>
-              <w:spacing w:before="40" w:after="60" w:line="288" w:lineRule="auto"/>
+              <w:spacing w:before="60" w:after="100" w:line="324" w:lineRule="auto"/>
               <w:jc w:val="center"/>
             </w:pPr>
             <w:r>
@@ -11687,7 +11687,7 @@
           </w:p>
           <w:p>
             <w:pPr>
-              <w:spacing w:before="40" w:after="60" w:line="288" w:lineRule="auto"/>
+              <w:spacing w:before="60" w:after="100" w:line="324" w:lineRule="auto"/>
               <w:jc w:val="center"/>
             </w:pPr>
             <w:r>
@@ -11714,7 +11714,7 @@
           </w:tcPr>
           <w:p>
             <w:pPr>
-              <w:spacing w:before="40" w:after="60" w:line="288" w:lineRule="auto"/>
+              <w:spacing w:before="60" w:after="100" w:line="324" w:lineRule="auto"/>
               <w:jc w:val="center"/>
             </w:pPr>
             <w:r>
@@ -11729,7 +11729,7 @@
           </w:p>
           <w:p>
             <w:pPr>
-              <w:spacing w:before="40" w:after="60" w:line="288" w:lineRule="auto"/>
+              <w:spacing w:before="60" w:after="100" w:line="324" w:lineRule="auto"/>
               <w:jc w:val="center"/>
             </w:pPr>
             <w:r>
@@ -11756,7 +11756,7 @@
           </w:tcPr>
           <w:p>
             <w:pPr>
-              <w:spacing w:before="40" w:after="60" w:line="288" w:lineRule="auto"/>
+              <w:spacing w:before="60" w:after="100" w:line="324" w:lineRule="auto"/>
               <w:jc w:val="left"/>
             </w:pPr>
             <w:r>
@@ -11842,7 +11842,7 @@
           </w:p>
           <w:p>
             <w:pPr>
-              <w:spacing w:before="40" w:after="60" w:line="288" w:lineRule="auto"/>
+              <w:spacing w:before="60" w:after="100" w:line="324" w:lineRule="auto"/>
               <w:jc w:val="left"/>
             </w:pPr>
             <w:r>
@@ -11857,7 +11857,7 @@
           </w:p>
           <w:p>
             <w:pPr>
-              <w:spacing w:before="40" w:after="60" w:line="288" w:lineRule="auto"/>
+              <w:spacing w:before="60" w:after="100" w:line="324" w:lineRule="auto"/>
               <w:jc w:val="left"/>
             </w:pPr>
             <w:r>
@@ -11916,7 +11916,7 @@
           </w:p>
           <w:p>
             <w:pPr>
-              <w:spacing w:before="40" w:after="60" w:line="288" w:lineRule="auto"/>
+              <w:spacing w:before="60" w:after="100" w:line="324" w:lineRule="auto"/>
               <w:jc w:val="left"/>
             </w:pPr>
             <w:r>
@@ -12019,7 +12019,7 @@
           </w:p>
           <w:p>
             <w:pPr>
-              <w:spacing w:before="40" w:after="60" w:line="288" w:lineRule="auto"/>
+              <w:spacing w:before="60" w:after="100" w:line="324" w:lineRule="auto"/>
               <w:jc w:val="left"/>
             </w:pPr>
             <w:r>
@@ -12081,7 +12081,7 @@
           </w:p>
           <w:p>
             <w:pPr>
-              <w:spacing w:before="40" w:after="60" w:line="288" w:lineRule="auto"/>
+              <w:spacing w:before="60" w:after="100" w:line="324" w:lineRule="auto"/>
               <w:jc w:val="left"/>
             </w:pPr>
             <w:r>
@@ -12137,7 +12137,7 @@
           </w:p>
           <w:p>
             <w:pPr>
-              <w:spacing w:before="40" w:after="60" w:line="288" w:lineRule="auto"/>
+              <w:spacing w:before="60" w:after="100" w:line="324" w:lineRule="auto"/>
               <w:jc w:val="left"/>
             </w:pPr>
             <w:r>
@@ -12265,7 +12265,7 @@
           </w:tcPr>
           <w:p>
             <w:pPr>
-              <w:spacing w:before="40" w:after="60" w:line="288" w:lineRule="auto"/>
+              <w:spacing w:before="60" w:after="100" w:line="324" w:lineRule="auto"/>
               <w:jc w:val="left"/>
             </w:pPr>
             <w:r>
@@ -12280,7 +12280,7 @@
           </w:p>
           <w:p>
             <w:pPr>
-              <w:spacing w:before="40" w:after="60" w:line="288" w:lineRule="auto"/>
+              <w:spacing w:before="60" w:after="100" w:line="324" w:lineRule="auto"/>
               <w:jc w:val="left"/>
             </w:pPr>
             <w:r>
@@ -12307,7 +12307,7 @@
           </w:tcPr>
           <w:p>
             <w:pPr>
-              <w:spacing w:before="40" w:after="60" w:line="288" w:lineRule="auto"/>
+              <w:spacing w:before="60" w:after="100" w:line="324" w:lineRule="auto"/>
               <w:jc w:val="left"/>
             </w:pPr>
             <w:r>
@@ -12322,7 +12322,7 @@
           </w:p>
           <w:p>
             <w:pPr>
-              <w:spacing w:before="40" w:after="60" w:line="288" w:lineRule="auto"/>
+              <w:spacing w:before="60" w:after="100" w:line="324" w:lineRule="auto"/>
               <w:jc w:val="left"/>
             </w:pPr>
             <w:r>
@@ -12337,7 +12337,7 @@
           </w:p>
           <w:p>
             <w:pPr>
-              <w:spacing w:before="40" w:after="60" w:line="288" w:lineRule="auto"/>
+              <w:spacing w:before="60" w:after="100" w:line="324" w:lineRule="auto"/>
               <w:jc w:val="left"/>
             </w:pPr>
             <w:r>
@@ -12366,7 +12366,7 @@
           </w:tcPr>
           <w:p>
             <w:pPr>
-              <w:spacing w:before="40" w:after="60" w:line="288" w:lineRule="auto"/>
+              <w:spacing w:before="60" w:after="100" w:line="324" w:lineRule="auto"/>
               <w:jc w:val="center"/>
             </w:pPr>
             <w:r>
@@ -12381,7 +12381,7 @@
           </w:p>
           <w:p>
             <w:pPr>
-              <w:spacing w:before="40" w:after="60" w:line="288" w:lineRule="auto"/>
+              <w:spacing w:before="60" w:after="100" w:line="324" w:lineRule="auto"/>
               <w:jc w:val="center"/>
             </w:pPr>
             <w:r>
@@ -12408,7 +12408,7 @@
           </w:tcPr>
           <w:p>
             <w:pPr>
-              <w:spacing w:before="40" w:after="60" w:line="288" w:lineRule="auto"/>
+              <w:spacing w:before="60" w:after="100" w:line="324" w:lineRule="auto"/>
               <w:jc w:val="center"/>
             </w:pPr>
             <w:r>
@@ -12423,7 +12423,7 @@
           </w:p>
           <w:p>
             <w:pPr>
-              <w:spacing w:before="40" w:after="60" w:line="288" w:lineRule="auto"/>
+              <w:spacing w:before="60" w:after="100" w:line="324" w:lineRule="auto"/>
               <w:jc w:val="center"/>
             </w:pPr>
             <w:r>
@@ -12450,7 +12450,7 @@
           </w:tcPr>
           <w:p>
             <w:pPr>
-              <w:spacing w:before="40" w:after="60" w:line="288" w:lineRule="auto"/>
+              <w:spacing w:before="60" w:after="100" w:line="324" w:lineRule="auto"/>
               <w:jc w:val="left"/>
             </w:pPr>
             <w:r>
@@ -12465,7 +12465,7 @@
           </w:p>
           <w:p>
             <w:pPr>
-              <w:spacing w:before="40" w:after="60" w:line="288" w:lineRule="auto"/>
+              <w:spacing w:before="60" w:after="100" w:line="324" w:lineRule="auto"/>
               <w:jc w:val="left"/>
             </w:pPr>
             <w:r>
@@ -12480,7 +12480,7 @@
           </w:p>
           <w:p>
             <w:pPr>
-              <w:spacing w:before="40" w:after="60" w:line="288" w:lineRule="auto"/>
+              <w:spacing w:before="60" w:after="100" w:line="324" w:lineRule="auto"/>
               <w:jc w:val="left"/>
             </w:pPr>
             <w:r>
@@ -12507,7 +12507,7 @@
           </w:tcPr>
           <w:p>
             <w:pPr>
-              <w:spacing w:before="40" w:after="60" w:line="288" w:lineRule="auto"/>
+              <w:spacing w:before="60" w:after="100" w:line="324" w:lineRule="auto"/>
               <w:jc w:val="left"/>
             </w:pPr>
             <w:r>
@@ -12522,7 +12522,7 @@
           </w:p>
           <w:p>
             <w:pPr>
-              <w:spacing w:before="40" w:after="60" w:line="288" w:lineRule="auto"/>
+              <w:spacing w:before="60" w:after="100" w:line="324" w:lineRule="auto"/>
               <w:jc w:val="left"/>
             </w:pPr>
             <w:r>
@@ -12549,7 +12549,7 @@
           </w:tcPr>
           <w:p>
             <w:pPr>
-              <w:spacing w:before="40" w:after="60" w:line="288" w:lineRule="auto"/>
+              <w:spacing w:before="60" w:after="100" w:line="324" w:lineRule="auto"/>
               <w:jc w:val="left"/>
             </w:pPr>
             <w:r>
@@ -12564,7 +12564,7 @@
           </w:p>
           <w:p>
             <w:pPr>
-              <w:spacing w:before="40" w:after="60" w:line="288" w:lineRule="auto"/>
+              <w:spacing w:before="60" w:after="100" w:line="324" w:lineRule="auto"/>
               <w:jc w:val="left"/>
             </w:pPr>
             <w:r>
@@ -12579,7 +12579,7 @@
           </w:p>
           <w:p>
             <w:pPr>
-              <w:spacing w:before="40" w:after="60" w:line="288" w:lineRule="auto"/>
+              <w:spacing w:before="60" w:after="100" w:line="324" w:lineRule="auto"/>
               <w:jc w:val="left"/>
             </w:pPr>
             <w:r>
@@ -12608,7 +12608,7 @@
           </w:tcPr>
           <w:p>
             <w:pPr>
-              <w:spacing w:before="40" w:after="60" w:line="288" w:lineRule="auto"/>
+              <w:spacing w:before="60" w:after="100" w:line="324" w:lineRule="auto"/>
               <w:jc w:val="center"/>
             </w:pPr>
             <w:r>
@@ -12623,7 +12623,7 @@
           </w:p>
           <w:p>
             <w:pPr>
-              <w:spacing w:before="40" w:after="60" w:line="288" w:lineRule="auto"/>
+              <w:spacing w:before="60" w:after="100" w:line="324" w:lineRule="auto"/>
               <w:jc w:val="center"/>
             </w:pPr>
             <w:r>
@@ -12650,7 +12650,7 @@
           </w:tcPr>
           <w:p>
             <w:pPr>
-              <w:spacing w:before="40" w:after="60" w:line="288" w:lineRule="auto"/>
+              <w:spacing w:before="60" w:after="100" w:line="324" w:lineRule="auto"/>
               <w:jc w:val="center"/>
             </w:pPr>
             <w:r>
@@ -12677,7 +12677,7 @@
           </w:tcPr>
           <w:p>
             <w:pPr>
-              <w:spacing w:before="40" w:after="60" w:line="288" w:lineRule="auto"/>
+              <w:spacing w:before="60" w:after="100" w:line="324" w:lineRule="auto"/>
               <w:jc w:val="left"/>
             </w:pPr>
             <w:r>
@@ -12692,7 +12692,7 @@
           </w:p>
           <w:p>
             <w:pPr>
-              <w:spacing w:before="40" w:after="60" w:line="288" w:lineRule="auto"/>
+              <w:spacing w:before="60" w:after="100" w:line="324" w:lineRule="auto"/>
               <w:jc w:val="left"/>
             </w:pPr>
             <w:r>
@@ -12719,7 +12719,7 @@
           </w:tcPr>
           <w:p>
             <w:pPr>
-              <w:spacing w:before="40" w:after="60" w:line="288" w:lineRule="auto"/>
+              <w:spacing w:before="60" w:after="100" w:line="324" w:lineRule="auto"/>
               <w:jc w:val="left"/>
             </w:pPr>
             <w:r>
@@ -12734,7 +12734,7 @@
           </w:p>
           <w:p>
             <w:pPr>
-              <w:spacing w:before="40" w:after="60" w:line="288" w:lineRule="auto"/>
+              <w:spacing w:before="60" w:after="100" w:line="324" w:lineRule="auto"/>
               <w:jc w:val="left"/>
             </w:pPr>
             <w:r>
@@ -12761,7 +12761,7 @@
           </w:tcPr>
           <w:p>
             <w:pPr>
-              <w:spacing w:before="40" w:after="60" w:line="288" w:lineRule="auto"/>
+              <w:spacing w:before="60" w:after="100" w:line="324" w:lineRule="auto"/>
               <w:jc w:val="left"/>
             </w:pPr>
             <w:r>
@@ -12850,7 +12850,7 @@
           </w:tcPr>
           <w:p>
             <w:pPr>
-              <w:spacing w:before="40" w:after="60" w:line="288" w:lineRule="auto"/>
+              <w:spacing w:before="60" w:after="100" w:line="324" w:lineRule="auto"/>
               <w:jc w:val="center"/>
             </w:pPr>
             <w:r>
@@ -12877,7 +12877,7 @@
           </w:tcPr>
           <w:p>
             <w:pPr>
-              <w:spacing w:before="40" w:after="60" w:line="288" w:lineRule="auto"/>
+              <w:spacing w:before="60" w:after="100" w:line="324" w:lineRule="auto"/>
               <w:jc w:val="center"/>
             </w:pPr>
             <w:r>
@@ -12904,7 +12904,7 @@
           </w:tcPr>
           <w:p>
             <w:pPr>
-              <w:spacing w:before="40" w:after="60" w:line="288" w:lineRule="auto"/>
+              <w:spacing w:before="60" w:after="100" w:line="324" w:lineRule="auto"/>
               <w:jc w:val="center"/>
             </w:pPr>
             <w:r>
@@ -12931,7 +12931,7 @@
           </w:tcPr>
           <w:p>
             <w:pPr>
-              <w:spacing w:before="40" w:after="60" w:line="288" w:lineRule="auto"/>
+              <w:spacing w:before="60" w:after="100" w:line="324" w:lineRule="auto"/>
               <w:jc w:val="center"/>
             </w:pPr>
             <w:r>
@@ -12958,7 +12958,7 @@
           </w:tcPr>
           <w:p>
             <w:pPr>
-              <w:spacing w:before="40" w:after="60" w:line="288" w:lineRule="auto"/>
+              <w:spacing w:before="60" w:after="100" w:line="324" w:lineRule="auto"/>
               <w:jc w:val="center"/>
             </w:pPr>
             <w:r>
@@ -12987,7 +12987,7 @@
           </w:tcPr>
           <w:p>
             <w:pPr>
-              <w:spacing w:before="40" w:after="60" w:line="288" w:lineRule="auto"/>
+              <w:spacing w:before="60" w:after="100" w:line="324" w:lineRule="auto"/>
               <w:jc w:val="center"/>
             </w:pPr>
             <w:r>
@@ -13014,7 +13014,7 @@
           </w:tcPr>
           <w:p>
             <w:pPr>
-              <w:spacing w:before="40" w:after="60" w:line="288" w:lineRule="auto"/>
+              <w:spacing w:before="60" w:after="100" w:line="324" w:lineRule="auto"/>
               <w:jc w:val="left"/>
             </w:pPr>
             <w:r>
@@ -13055,7 +13055,7 @@
           </w:tcPr>
           <w:p>
             <w:pPr>
-              <w:spacing w:before="40" w:after="60" w:line="288" w:lineRule="auto"/>
+              <w:spacing w:before="60" w:after="100" w:line="324" w:lineRule="auto"/>
               <w:jc w:val="left"/>
             </w:pPr>
             <w:r>
@@ -13082,7 +13082,7 @@
           </w:tcPr>
           <w:p>
             <w:pPr>
-              <w:spacing w:before="40" w:after="60" w:line="288" w:lineRule="auto"/>
+              <w:spacing w:before="60" w:after="100" w:line="324" w:lineRule="auto"/>
               <w:jc w:val="left"/>
             </w:pPr>
             <w:r>
@@ -13109,7 +13109,7 @@
           </w:tcPr>
           <w:p>
             <w:pPr>
-              <w:spacing w:before="40" w:after="60" w:line="288" w:lineRule="auto"/>
+              <w:spacing w:before="60" w:after="100" w:line="324" w:lineRule="auto"/>
               <w:jc w:val="left"/>
             </w:pPr>
             <w:r>
@@ -13138,7 +13138,7 @@
           </w:tcPr>
           <w:p>
             <w:pPr>
-              <w:spacing w:before="40" w:after="60" w:line="288" w:lineRule="auto"/>
+              <w:spacing w:before="60" w:after="100" w:line="324" w:lineRule="auto"/>
               <w:jc w:val="center"/>
             </w:pPr>
             <w:r>
@@ -13165,7 +13165,7 @@
           </w:tcPr>
           <w:p>
             <w:pPr>
-              <w:spacing w:before="40" w:after="60" w:line="288" w:lineRule="auto"/>
+              <w:spacing w:before="60" w:after="100" w:line="324" w:lineRule="auto"/>
               <w:jc w:val="left"/>
             </w:pPr>
             <w:r>
@@ -13192,7 +13192,7 @@
           </w:tcPr>
           <w:p>
             <w:pPr>
-              <w:spacing w:before="40" w:after="60" w:line="288" w:lineRule="auto"/>
+              <w:spacing w:before="60" w:after="100" w:line="324" w:lineRule="auto"/>
               <w:jc w:val="left"/>
             </w:pPr>
             <w:r>
@@ -13219,7 +13219,7 @@
           </w:tcPr>
           <w:p>
             <w:pPr>
-              <w:spacing w:before="40" w:after="60" w:line="288" w:lineRule="auto"/>
+              <w:spacing w:before="60" w:after="100" w:line="324" w:lineRule="auto"/>
               <w:jc w:val="left"/>
             </w:pPr>
             <w:r>
@@ -13246,7 +13246,7 @@
           </w:tcPr>
           <w:p>
             <w:pPr>
-              <w:spacing w:before="40" w:after="60" w:line="288" w:lineRule="auto"/>
+              <w:spacing w:before="60" w:after="100" w:line="324" w:lineRule="auto"/>
               <w:jc w:val="left"/>
             </w:pPr>
             <w:r>
@@ -13275,7 +13275,7 @@
           </w:tcPr>
           <w:p>
             <w:pPr>
-              <w:spacing w:before="40" w:after="60" w:line="288" w:lineRule="auto"/>
+              <w:spacing w:before="60" w:after="100" w:line="324" w:lineRule="auto"/>
               <w:jc w:val="center"/>
             </w:pPr>
             <w:r>
@@ -13302,7 +13302,7 @@
           </w:tcPr>
           <w:p>
             <w:pPr>
-              <w:spacing w:before="40" w:after="60" w:line="288" w:lineRule="auto"/>
+              <w:spacing w:before="60" w:after="100" w:line="324" w:lineRule="auto"/>
               <w:jc w:val="left"/>
             </w:pPr>
             <w:r>
@@ -13329,7 +13329,7 @@
           </w:tcPr>
           <w:p>
             <w:pPr>
-              <w:spacing w:before="40" w:after="60" w:line="288" w:lineRule="auto"/>
+              <w:spacing w:before="60" w:after="100" w:line="324" w:lineRule="auto"/>
               <w:jc w:val="left"/>
             </w:pPr>
             <w:r>
@@ -13356,7 +13356,7 @@
           </w:tcPr>
           <w:p>
             <w:pPr>
-              <w:spacing w:before="40" w:after="60" w:line="288" w:lineRule="auto"/>
+              <w:spacing w:before="60" w:after="100" w:line="324" w:lineRule="auto"/>
               <w:jc w:val="left"/>
             </w:pPr>
             <w:r>
@@ -13430,7 +13430,7 @@
           </w:tcPr>
           <w:p>
             <w:pPr>
-              <w:spacing w:before="40" w:after="60" w:line="288" w:lineRule="auto"/>
+              <w:spacing w:before="60" w:after="100" w:line="324" w:lineRule="auto"/>
               <w:jc w:val="left"/>
             </w:pPr>
             <w:r>
@@ -13459,7 +13459,7 @@
           </w:tcPr>
           <w:p>
             <w:pPr>
-              <w:spacing w:before="40" w:after="60" w:line="288" w:lineRule="auto"/>
+              <w:spacing w:before="60" w:after="100" w:line="324" w:lineRule="auto"/>
               <w:jc w:val="center"/>
             </w:pPr>
             <w:r>
@@ -13486,7 +13486,7 @@
           </w:tcPr>
           <w:p>
             <w:pPr>
-              <w:spacing w:before="40" w:after="60" w:line="288" w:lineRule="auto"/>
+              <w:spacing w:before="60" w:after="100" w:line="324" w:lineRule="auto"/>
               <w:jc w:val="left"/>
             </w:pPr>
             <w:r>
@@ -13513,7 +13513,7 @@
           </w:tcPr>
           <w:p>
             <w:pPr>
-              <w:spacing w:before="40" w:after="60" w:line="288" w:lineRule="auto"/>
+              <w:spacing w:before="60" w:after="100" w:line="324" w:lineRule="auto"/>
               <w:jc w:val="left"/>
             </w:pPr>
             <w:r>
@@ -13540,7 +13540,7 @@
           </w:tcPr>
           <w:p>
             <w:pPr>
-              <w:spacing w:before="40" w:after="60" w:line="288" w:lineRule="auto"/>
+              <w:spacing w:before="60" w:after="100" w:line="324" w:lineRule="auto"/>
               <w:jc w:val="left"/>
             </w:pPr>
             <w:r>
@@ -13567,7 +13567,7 @@
           </w:tcPr>
           <w:p>
             <w:pPr>
-              <w:spacing w:before="40" w:after="60" w:line="288" w:lineRule="auto"/>
+              <w:spacing w:before="60" w:after="100" w:line="324" w:lineRule="auto"/>
               <w:jc w:val="left"/>
             </w:pPr>
             <w:r>

</xml_diff>